<commit_message>
Add chat system (pool system, signalR after the first MVP)
</commit_message>
<xml_diff>
--- a/Miscellaneous/Documentation technique - CM.docx
+++ b/Miscellaneous/Documentation technique - CM.docx
@@ -2,201 +2,1811 @@
 <file path=word/document.xml><?xml version="1.0" encoding="utf-8"?>
 <w:document xmlns:wpc="http://schemas.microsoft.com/office/word/2010/wordprocessingCanvas" xmlns:cx="http://schemas.microsoft.com/office/drawing/2014/chartex" xmlns:cx1="http://schemas.microsoft.com/office/drawing/2015/9/8/chartex" xmlns:cx2="http://schemas.microsoft.com/office/drawing/2015/10/21/chartex" xmlns:cx3="http://schemas.microsoft.com/office/drawing/2016/5/9/chartex" xmlns:cx4="http://schemas.microsoft.com/office/drawing/2016/5/10/chartex" xmlns:cx5="http://schemas.microsoft.com/office/drawing/2016/5/11/chartex" xmlns:cx6="http://schemas.microsoft.com/office/drawing/2016/5/12/chartex" xmlns:cx7="http://schemas.microsoft.com/office/drawing/2016/5/13/chartex" xmlns:cx8="http://schemas.microsoft.com/office/drawing/2016/5/14/chartex" xmlns:mc="http://schemas.openxmlformats.org/markup-compatibility/2006" xmlns:aink="http://schemas.microsoft.com/office/drawing/2016/ink" xmlns:am3d="http://schemas.microsoft.com/office/drawing/2017/model3d" xmlns:o="urn:schemas-microsoft-com:office:office" xmlns:oel="http://schemas.microsoft.com/office/2019/extlst" xmlns:r="http://schemas.openxmlformats.org/officeDocument/2006/relationships" xmlns:m="http://schemas.openxmlformats.org/officeDocument/2006/math" xmlns:v="urn:schemas-microsoft-com:vml" xmlns:wp14="http://schemas.microsoft.com/office/word/2010/wordprocessingDrawing" xmlns:wp="http://schemas.openxmlformats.org/drawingml/2006/wordprocessingDrawing" xmlns:w10="urn:schemas-microsoft-com:office:word" xmlns:w="http://schemas.openxmlformats.org/wordprocessingml/2006/main" xmlns:w14="http://schemas.microsoft.com/office/word/2010/wordml" xmlns:w15="http://schemas.microsoft.com/office/word/2012/wordml" xmlns:w16cex="http://schemas.microsoft.com/office/word/2018/wordml/cex" xmlns:w16cid="http://schemas.microsoft.com/office/word/2016/wordml/cid" xmlns:w16="http://schemas.microsoft.com/office/word/2018/wordml" xmlns:w16du="http://schemas.microsoft.com/office/word/2023/wordml/word16du" xmlns:w16sdtdh="http://schemas.microsoft.com/office/word/2020/wordml/sdtdatahash" xmlns:w16sdtfl="http://schemas.microsoft.com/office/word/2024/wordml/sdtformatlock" xmlns:w16se="http://schemas.microsoft.com/office/word/2015/wordml/symex" xmlns:wpg="http://schemas.microsoft.com/office/word/2010/wordprocessingGroup" xmlns:wpi="http://schemas.microsoft.com/office/word/2010/wordprocessingInk" xmlns:wne="http://schemas.microsoft.com/office/word/2006/wordml" xmlns:wps="http://schemas.microsoft.com/office/word/2010/wordprocessingShape" mc:Ignorable="w14 w15 w16se w16cid w16 w16cex w16sdtdh w16sdtfl w16du wp14">
   <w:body>
-    <w:p>
-      <w:pPr>
-        <w:pStyle w:val="Heading1"/>
-        <w:jc w:val="center"/>
-        <w:rPr>
-          <w:rFonts w:asciiTheme="minorHAnsi" w:hAnsiTheme="minorHAnsi"/>
-        </w:rPr>
-      </w:pPr>
-    </w:p>
-    <w:p>
-      <w:pPr>
-        <w:pStyle w:val="Heading1"/>
-        <w:jc w:val="center"/>
-        <w:rPr>
-          <w:rFonts w:asciiTheme="minorHAnsi" w:hAnsiTheme="minorHAnsi"/>
-        </w:rPr>
-      </w:pPr>
-    </w:p>
-    <w:p>
-      <w:pPr>
-        <w:pStyle w:val="Heading1"/>
-        <w:jc w:val="center"/>
-        <w:rPr>
-          <w:rFonts w:asciiTheme="minorHAnsi" w:hAnsiTheme="minorHAnsi"/>
-        </w:rPr>
-      </w:pPr>
-    </w:p>
-    <w:p>
-      <w:pPr>
-        <w:pStyle w:val="Heading1"/>
-        <w:jc w:val="center"/>
-        <w:rPr>
-          <w:rFonts w:asciiTheme="minorHAnsi" w:hAnsiTheme="minorHAnsi"/>
-        </w:rPr>
-      </w:pPr>
-    </w:p>
-    <w:p>
-      <w:pPr>
-        <w:pStyle w:val="Heading1"/>
-        <w:jc w:val="center"/>
-        <w:rPr>
-          <w:rFonts w:asciiTheme="minorHAnsi" w:hAnsiTheme="minorHAnsi"/>
-        </w:rPr>
-      </w:pPr>
-    </w:p>
-    <w:p>
-      <w:pPr>
-        <w:pStyle w:val="Heading1"/>
-        <w:jc w:val="center"/>
-        <w:rPr>
-          <w:rFonts w:asciiTheme="minorHAnsi" w:hAnsiTheme="minorHAnsi"/>
-        </w:rPr>
-      </w:pPr>
-    </w:p>
-    <w:p>
-      <w:pPr>
-        <w:pStyle w:val="Heading1"/>
-        <w:jc w:val="center"/>
-        <w:rPr>
-          <w:rFonts w:asciiTheme="minorHAnsi" w:hAnsiTheme="minorHAnsi"/>
-        </w:rPr>
-      </w:pPr>
-      <w:r>
-        <w:rPr>
-          <w:rFonts w:asciiTheme="minorHAnsi" w:hAnsiTheme="minorHAnsi"/>
+    <w:p/>
+    <w:p/>
+    <w:p/>
+    <w:p/>
+    <w:p/>
+    <w:p/>
+    <w:p/>
+    <w:p/>
+    <w:p/>
+    <w:p/>
+    <w:p/>
+    <w:p/>
+    <w:p>
+      <w:pPr>
+        <w:pStyle w:val="Titre1"/>
+        <w:rPr>
+          <w:color w:val="275317" w:themeColor="accent6" w:themeShade="80"/>
+        </w:rPr>
+      </w:pPr>
+      <w:r>
+        <w:rPr>
+          <w:color w:val="275317" w:themeColor="accent6" w:themeShade="80"/>
         </w:rPr>
         <w:t>Documentation Technique</w:t>
       </w:r>
       <w:r>
         <w:rPr>
-          <w:rFonts w:asciiTheme="minorHAnsi" w:hAnsiTheme="minorHAnsi"/>
+          <w:color w:val="275317" w:themeColor="accent6" w:themeShade="80"/>
         </w:rPr>
         <w:br/>
         <w:t>Projet Fao</w:t>
       </w:r>
     </w:p>
     <w:p>
-      <w:pPr>
-        <w:pStyle w:val="Heading1"/>
-        <w:rPr>
-          <w:rFonts w:asciiTheme="minorHAnsi" w:hAnsiTheme="minorHAnsi"/>
-        </w:rPr>
-      </w:pPr>
-      <w:r>
-        <w:rPr>
-          <w:rFonts w:asciiTheme="minorHAnsi" w:hAnsiTheme="minorHAnsi"/>
-        </w:rPr>
+      <w:r>
         <w:br w:type="page"/>
       </w:r>
     </w:p>
     <w:p>
       <w:pPr>
+        <w:pStyle w:val="Titre2"/>
+        <w:rPr>
+          <w:color w:val="3A7C22" w:themeColor="accent6" w:themeShade="BF"/>
+        </w:rPr>
+      </w:pPr>
+      <w:r>
+        <w:rPr>
+          <w:color w:val="3A7C22" w:themeColor="accent6" w:themeShade="BF"/>
+        </w:rPr>
+        <w:lastRenderedPageBreak/>
+        <w:t>I -</w:t>
+      </w:r>
+      <w:r>
+        <w:rPr>
+          <w:color w:val="3A7C22" w:themeColor="accent6" w:themeShade="BF"/>
+        </w:rPr>
+        <w:t xml:space="preserve"> Présentation &amp; </w:t>
+      </w:r>
+      <w:r>
+        <w:rPr>
+          <w:color w:val="3A7C22" w:themeColor="accent6" w:themeShade="BF"/>
+        </w:rPr>
+        <w:t>Objectifs</w:t>
+      </w:r>
+    </w:p>
+    <w:p>
+      <w:pPr>
+        <w:ind w:firstLine="708"/>
+      </w:pPr>
+      <w:r>
+        <w:t>Le projet Fao (nom de code)</w:t>
+      </w:r>
+      <w:r>
+        <w:t xml:space="preserve"> est une a</w:t>
+      </w:r>
+      <w:r>
+        <w:t>pplication web/mobile (</w:t>
+      </w:r>
+      <w:r>
+        <w:t>Progressive Web Application</w:t>
+      </w:r>
+      <w:r>
+        <w:t>) de mise en relation entre des coachs en nutrition et des particuliers. Les coachs conçoivent des plannings de repas personnalisés, suivent les progrès des utilisateurs (mensurations, poids, photos, notes libres) et échangent via une messagerie. Les particuliers consultent leur planning, recettes, peuvent proposer des substitutions depuis une base de recettes</w:t>
+      </w:r>
+      <w:r>
+        <w:t xml:space="preserve"> interne de l’application</w:t>
+      </w:r>
+      <w:r>
+        <w:t>, dialoguer avec leur coach</w:t>
+      </w:r>
+      <w:r>
+        <w:t xml:space="preserve"> et publier leur </w:t>
+      </w:r>
+      <w:r>
+        <w:t>progrès</w:t>
+      </w:r>
+      <w:r>
+        <w:t>.</w:t>
+      </w:r>
+    </w:p>
+    <w:p/>
+    <w:p>
+      <w:pPr>
+        <w:pStyle w:val="Titre3"/>
+        <w:rPr>
+          <w:color w:val="8DD873" w:themeColor="accent6" w:themeTint="99"/>
+        </w:rPr>
+      </w:pPr>
+      <w:r>
+        <w:rPr>
+          <w:color w:val="8DD873" w:themeColor="accent6" w:themeTint="99"/>
+        </w:rPr>
+        <w:t>A – Public cible</w:t>
+      </w:r>
+    </w:p>
+    <w:p>
+      <w:r>
+        <w:tab/>
+        <w:t>Le public cible de cette application se répartit en deux catégories :</w:t>
+      </w:r>
+    </w:p>
+    <w:p>
+      <w:pPr>
+        <w:numPr>
+          <w:ilvl w:val="0"/>
+          <w:numId w:val="1"/>
+        </w:numPr>
+      </w:pPr>
+      <w:r>
+        <w:rPr>
+          <w:u w:val="single"/>
+        </w:rPr>
+        <w:t xml:space="preserve">Les </w:t>
+      </w:r>
+      <w:r>
+        <w:rPr>
+          <w:u w:val="single"/>
+        </w:rPr>
+        <w:t>Particulier</w:t>
+      </w:r>
+      <w:r>
+        <w:rPr>
+          <w:u w:val="single"/>
+        </w:rPr>
+        <w:t>s</w:t>
+      </w:r>
+      <w:r>
+        <w:rPr>
+          <w:u w:val="single"/>
+        </w:rPr>
+        <w:t> :</w:t>
+      </w:r>
+      <w:r>
+        <w:t xml:space="preserve"> </w:t>
+      </w:r>
+      <w:r>
+        <w:t xml:space="preserve">Ce sont les </w:t>
+      </w:r>
+      <w:r>
+        <w:t>utilisateur</w:t>
+      </w:r>
+      <w:r>
+        <w:t>s</w:t>
+      </w:r>
+      <w:r>
+        <w:t xml:space="preserve"> fina</w:t>
+      </w:r>
+      <w:r>
+        <w:t>ux</w:t>
+      </w:r>
+      <w:r>
+        <w:t xml:space="preserve">, </w:t>
+      </w:r>
+      <w:r>
+        <w:t>sans distinction d‘âge ni sexe</w:t>
+      </w:r>
+      <w:r>
+        <w:t>.</w:t>
+      </w:r>
+    </w:p>
+    <w:p>
+      <w:pPr>
+        <w:numPr>
+          <w:ilvl w:val="0"/>
+          <w:numId w:val="1"/>
+        </w:numPr>
+      </w:pPr>
+      <w:r>
+        <w:rPr>
+          <w:u w:val="single"/>
+        </w:rPr>
+        <w:t xml:space="preserve">Les </w:t>
+      </w:r>
+      <w:r>
+        <w:rPr>
+          <w:u w:val="single"/>
+        </w:rPr>
+        <w:t>Coach</w:t>
+      </w:r>
+      <w:r>
+        <w:rPr>
+          <w:u w:val="single"/>
+        </w:rPr>
+        <w:t>s :</w:t>
+      </w:r>
+      <w:r>
+        <w:t xml:space="preserve"> C</w:t>
+      </w:r>
+      <w:r>
+        <w:t>e sont des</w:t>
+      </w:r>
+      <w:r>
+        <w:t xml:space="preserve"> professionnels</w:t>
+      </w:r>
+      <w:r>
+        <w:t xml:space="preserve"> diplômés en nutrition et habilités à accompagner les utilisateurs.</w:t>
+      </w:r>
+    </w:p>
+    <w:p/>
+    <w:p>
+      <w:pPr>
+        <w:pStyle w:val="Titre3"/>
+        <w:rPr>
+          <w:color w:val="8DD873" w:themeColor="accent6" w:themeTint="99"/>
+        </w:rPr>
+      </w:pPr>
+      <w:r>
+        <w:rPr>
+          <w:color w:val="8DD873" w:themeColor="accent6" w:themeTint="99"/>
+        </w:rPr>
+        <w:t>B – Objectifs</w:t>
+      </w:r>
+    </w:p>
+    <w:p>
+      <w:r>
+        <w:tab/>
+        <w:t>L’Objectif de l’application est de mettre en relation les particuliers avec des professionnels habilité à accompagner ces derniers pour mieux gérer leur repas. L’application sera connectée à l’API, elle-même relié à une base de données.</w:t>
+      </w:r>
+      <w:r>
+        <w:t xml:space="preserve"> Elle sera accessible via un navigateur et aussi via une application web.</w:t>
+      </w:r>
+    </w:p>
+    <w:p>
+      <w:r>
+        <w:br w:type="page"/>
+      </w:r>
+    </w:p>
+    <w:p>
+      <w:pPr>
+        <w:pStyle w:val="Titre2"/>
+        <w:rPr>
+          <w:color w:val="3A7C22" w:themeColor="accent6" w:themeShade="BF"/>
+        </w:rPr>
+      </w:pPr>
+      <w:r>
+        <w:rPr>
+          <w:color w:val="3A7C22" w:themeColor="accent6" w:themeShade="BF"/>
+        </w:rPr>
+        <w:lastRenderedPageBreak/>
+        <w:t xml:space="preserve">II - </w:t>
+      </w:r>
+      <w:r>
+        <w:rPr>
+          <w:color w:val="3A7C22" w:themeColor="accent6" w:themeShade="BF"/>
+        </w:rPr>
+        <w:t>Périmètre fonctionnel</w:t>
+      </w:r>
+    </w:p>
+    <w:p>
+      <w:pPr>
+        <w:pStyle w:val="Titre3"/>
+        <w:rPr>
+          <w:color w:val="8DD873" w:themeColor="accent6" w:themeTint="99"/>
+        </w:rPr>
+      </w:pPr>
+      <w:r>
+        <w:rPr>
+          <w:color w:val="8DD873" w:themeColor="accent6" w:themeTint="99"/>
+        </w:rPr>
+        <w:t>A</w:t>
+      </w:r>
+      <w:r>
+        <w:rPr>
+          <w:color w:val="8DD873" w:themeColor="accent6" w:themeTint="99"/>
+        </w:rPr>
+        <w:t xml:space="preserve"> </w:t>
+      </w:r>
+      <w:r>
+        <w:rPr>
+          <w:color w:val="8DD873" w:themeColor="accent6" w:themeTint="99"/>
+        </w:rPr>
+        <w:t xml:space="preserve">– </w:t>
+      </w:r>
+      <w:r>
+        <w:rPr>
+          <w:color w:val="8DD873" w:themeColor="accent6" w:themeTint="99"/>
+        </w:rPr>
+        <w:t>Particulier</w:t>
+      </w:r>
+    </w:p>
+    <w:p>
+      <w:r>
+        <w:tab/>
+        <w:t xml:space="preserve">Le particulier pourra se connecter à l’application lorsque son coach lui aura créer un compte au préalable. Sur cette dernière, il pourra : </w:t>
+      </w:r>
+    </w:p>
+    <w:p>
+      <w:pPr>
+        <w:numPr>
+          <w:ilvl w:val="0"/>
+          <w:numId w:val="2"/>
+        </w:numPr>
+      </w:pPr>
+      <w:r>
+        <w:t>Consulter</w:t>
+      </w:r>
+      <w:r>
+        <w:t xml:space="preserve"> son</w:t>
+      </w:r>
+      <w:r>
+        <w:t xml:space="preserve"> planning de repas préparé par son coach (par jour/repas).</w:t>
+      </w:r>
+    </w:p>
+    <w:p>
+      <w:pPr>
+        <w:numPr>
+          <w:ilvl w:val="0"/>
+          <w:numId w:val="2"/>
+        </w:numPr>
+      </w:pPr>
+      <w:r>
+        <w:t>Consulter</w:t>
+      </w:r>
+      <w:r>
+        <w:t xml:space="preserve"> les différentes</w:t>
+      </w:r>
+      <w:r>
+        <w:t xml:space="preserve"> recettes (ingrédients, étapes, macros).</w:t>
+      </w:r>
+    </w:p>
+    <w:p>
+      <w:pPr>
+        <w:numPr>
+          <w:ilvl w:val="0"/>
+          <w:numId w:val="2"/>
+        </w:numPr>
+      </w:pPr>
+      <w:r>
+        <w:t>Remplacer</w:t>
+      </w:r>
+      <w:r>
+        <w:t xml:space="preserve"> une recette par une autre </w:t>
+      </w:r>
+      <w:r>
+        <w:t>en se servant</w:t>
+      </w:r>
+      <w:r>
+        <w:t xml:space="preserve"> de la base.</w:t>
+      </w:r>
+    </w:p>
+    <w:p>
+      <w:pPr>
+        <w:numPr>
+          <w:ilvl w:val="0"/>
+          <w:numId w:val="2"/>
+        </w:numPr>
+      </w:pPr>
+      <w:r>
+        <w:t>Dialoguer</w:t>
+      </w:r>
+      <w:r>
+        <w:t xml:space="preserve"> avec le coach (</w:t>
+      </w:r>
+      <w:r>
+        <w:t>système</w:t>
+      </w:r>
+      <w:r>
+        <w:t xml:space="preserve"> de discussion</w:t>
+      </w:r>
+      <w:r>
+        <w:t xml:space="preserve"> en</w:t>
+      </w:r>
+      <w:r>
+        <w:t xml:space="preserve"> temps réel).</w:t>
+      </w:r>
+    </w:p>
+    <w:p>
+      <w:pPr>
+        <w:numPr>
+          <w:ilvl w:val="0"/>
+          <w:numId w:val="2"/>
+        </w:numPr>
+      </w:pPr>
+      <w:r>
+        <w:t>S</w:t>
+      </w:r>
+      <w:r>
+        <w:t>aisi</w:t>
+      </w:r>
+      <w:r>
+        <w:t xml:space="preserve">r et </w:t>
+      </w:r>
+      <w:r>
+        <w:t>consult</w:t>
+      </w:r>
+      <w:r>
+        <w:t xml:space="preserve">er </w:t>
+      </w:r>
+      <w:r>
+        <w:t>plusieurs types de progrès réaliser avec son coach.</w:t>
+      </w:r>
+    </w:p>
+    <w:p>
+      <w:pPr>
+        <w:ind w:left="720"/>
+      </w:pPr>
+    </w:p>
+    <w:p>
+      <w:pPr>
+        <w:pStyle w:val="Titre3"/>
+        <w:rPr>
+          <w:color w:val="8DD873" w:themeColor="accent6" w:themeTint="99"/>
+        </w:rPr>
+      </w:pPr>
+      <w:r>
+        <w:rPr>
+          <w:color w:val="8DD873" w:themeColor="accent6" w:themeTint="99"/>
+        </w:rPr>
+        <w:t>B –</w:t>
+      </w:r>
+      <w:r>
+        <w:rPr>
+          <w:color w:val="8DD873" w:themeColor="accent6" w:themeTint="99"/>
+        </w:rPr>
+        <w:t xml:space="preserve"> Coach</w:t>
+      </w:r>
+    </w:p>
+    <w:p>
+      <w:r>
+        <w:tab/>
+        <w:t>Le coach pourra se connecter à l’application lorsque l’administrateur du système lui aura créer un compte au préalable. Ils accèdent ensuite à son tableau de bord dont il pourra :</w:t>
+      </w:r>
+    </w:p>
+    <w:p>
+      <w:pPr>
+        <w:numPr>
+          <w:ilvl w:val="0"/>
+          <w:numId w:val="3"/>
+        </w:numPr>
+      </w:pPr>
+      <w:r>
+        <w:t>Créer des comptes utilisateurs.</w:t>
+      </w:r>
+    </w:p>
+    <w:p>
+      <w:pPr>
+        <w:numPr>
+          <w:ilvl w:val="0"/>
+          <w:numId w:val="3"/>
+        </w:numPr>
+      </w:pPr>
+      <w:r>
+        <w:t>Accéder à la liste de ses utilisateurs suivis.</w:t>
+      </w:r>
+    </w:p>
+    <w:p>
+      <w:pPr>
+        <w:numPr>
+          <w:ilvl w:val="0"/>
+          <w:numId w:val="3"/>
+        </w:numPr>
+      </w:pPr>
+      <w:r>
+        <w:t xml:space="preserve">Gérer </w:t>
+      </w:r>
+      <w:r>
+        <w:t>l</w:t>
+      </w:r>
+      <w:r>
+        <w:t xml:space="preserve">es plannings </w:t>
+      </w:r>
+      <w:r>
+        <w:t>de ses</w:t>
+      </w:r>
+      <w:r>
+        <w:t xml:space="preserve"> utilisateur</w:t>
+      </w:r>
+      <w:r>
+        <w:t>s.</w:t>
+      </w:r>
+    </w:p>
+    <w:p>
+      <w:pPr>
+        <w:numPr>
+          <w:ilvl w:val="0"/>
+          <w:numId w:val="3"/>
+        </w:numPr>
+      </w:pPr>
+      <w:r>
+        <w:t xml:space="preserve">Accéder/éditer la </w:t>
+      </w:r>
+      <w:r>
+        <w:t>base de données</w:t>
+      </w:r>
+      <w:r>
+        <w:t xml:space="preserve"> de recettes</w:t>
+      </w:r>
+      <w:r>
+        <w:t>.</w:t>
+      </w:r>
+    </w:p>
+    <w:p>
+      <w:pPr>
+        <w:numPr>
+          <w:ilvl w:val="0"/>
+          <w:numId w:val="3"/>
+        </w:numPr>
+      </w:pPr>
+      <w:r>
+        <w:t>Consulter et répondre aux messages envoyés par ses utilisateurs</w:t>
+      </w:r>
+    </w:p>
+    <w:p>
+      <w:pPr>
+        <w:numPr>
+          <w:ilvl w:val="0"/>
+          <w:numId w:val="3"/>
+        </w:numPr>
+      </w:pPr>
+      <w:r>
+        <w:t>Consulter et/ou ajouter les progrès de ses utilisateurs.</w:t>
+      </w:r>
+    </w:p>
+    <w:p>
+      <w:pPr>
+        <w:ind w:left="720"/>
+      </w:pPr>
+    </w:p>
+    <w:p>
+      <w:pPr>
+        <w:pStyle w:val="Titre3"/>
+        <w:rPr>
+          <w:color w:val="8DD873" w:themeColor="accent6" w:themeTint="99"/>
+        </w:rPr>
+      </w:pPr>
+      <w:r>
+        <w:rPr>
+          <w:color w:val="8DD873" w:themeColor="accent6" w:themeTint="99"/>
+        </w:rPr>
+        <w:t>C – Administrateur</w:t>
+      </w:r>
+    </w:p>
+    <w:p>
+      <w:pPr>
+        <w:ind w:firstLine="708"/>
+      </w:pPr>
+      <w:r>
+        <w:t>L’administrateur dispose d’un accès complet à l’application. Son rôle est défini dès le déploiement de cette dernière. Il a accès à l’intégralité de la base de données et peut créer de nouveaux utilisateurs, qu’il s’agisse de coachs ou de particuliers.</w:t>
+      </w:r>
+    </w:p>
+    <w:p>
+      <w:r>
+        <w:br w:type="page"/>
+      </w:r>
+    </w:p>
+    <w:p>
+      <w:pPr>
+        <w:pStyle w:val="Titre3"/>
+        <w:rPr>
+          <w:color w:val="8DD873" w:themeColor="accent6" w:themeTint="99"/>
+        </w:rPr>
+      </w:pPr>
+      <w:r>
+        <w:rPr>
+          <w:color w:val="8DD873" w:themeColor="accent6" w:themeTint="99"/>
+        </w:rPr>
+        <w:lastRenderedPageBreak/>
+        <w:t>D</w:t>
+      </w:r>
+      <w:r>
+        <w:rPr>
+          <w:color w:val="8DD873" w:themeColor="accent6" w:themeTint="99"/>
+        </w:rPr>
+        <w:t xml:space="preserve"> -</w:t>
+      </w:r>
+      <w:r>
+        <w:rPr>
+          <w:color w:val="8DD873" w:themeColor="accent6" w:themeTint="99"/>
+        </w:rPr>
+        <w:t xml:space="preserve"> Hors périmètre (MVP)</w:t>
+      </w:r>
+    </w:p>
+    <w:p>
+      <w:pPr>
+        <w:ind w:firstLine="708"/>
+      </w:pPr>
+      <w:r>
+        <w:t xml:space="preserve">Lors de </w:t>
+      </w:r>
+      <w:r>
+        <w:t>future mise</w:t>
+      </w:r>
+      <w:r>
+        <w:t xml:space="preserve"> à jour,</w:t>
+      </w:r>
+      <w:r>
+        <w:t xml:space="preserve"> l’ajout </w:t>
+      </w:r>
+      <w:r>
+        <w:t>de</w:t>
+      </w:r>
+      <w:r>
+        <w:t xml:space="preserve"> </w:t>
+      </w:r>
+      <w:r>
+        <w:t xml:space="preserve">fonctionnalités permettant d’accroitre </w:t>
+      </w:r>
+      <w:r>
+        <w:t>la valeur ajoutée</w:t>
+      </w:r>
+      <w:r>
+        <w:t xml:space="preserve"> de l’application</w:t>
+      </w:r>
+      <w:r>
+        <w:t xml:space="preserve"> a été prévu. V</w:t>
+      </w:r>
+      <w:r>
+        <w:t>oici une liste non-exhaustive des futurs ajouts :</w:t>
+      </w:r>
+    </w:p>
+    <w:p>
+      <w:pPr>
+        <w:numPr>
+          <w:ilvl w:val="0"/>
+          <w:numId w:val="4"/>
+        </w:numPr>
+      </w:pPr>
+      <w:r>
+        <w:t>Système de recette avancé (Calorie, temps de préparations, macro)</w:t>
+      </w:r>
+    </w:p>
+    <w:p>
+      <w:pPr>
+        <w:numPr>
+          <w:ilvl w:val="0"/>
+          <w:numId w:val="4"/>
+        </w:numPr>
+      </w:pPr>
+      <w:r>
+        <w:t>Intégration des photos pour les recettes et les ingrédients</w:t>
+      </w:r>
+    </w:p>
+    <w:p>
+      <w:pPr>
+        <w:numPr>
+          <w:ilvl w:val="0"/>
+          <w:numId w:val="4"/>
+        </w:numPr>
+      </w:pPr>
+      <w:r>
+        <w:t>Messagerie en temps réel</w:t>
+      </w:r>
+      <w:r>
+        <w:t xml:space="preserve"> avec SignalR</w:t>
+      </w:r>
+    </w:p>
+    <w:p>
+      <w:pPr>
+        <w:numPr>
+          <w:ilvl w:val="0"/>
+          <w:numId w:val="4"/>
+        </w:numPr>
+      </w:pPr>
+      <w:r>
+        <w:t>Algorithme de recommandation avancé</w:t>
+      </w:r>
+      <w:r>
+        <w:t>.</w:t>
+      </w:r>
+    </w:p>
+    <w:p>
+      <w:r>
+        <w:br w:type="page"/>
+      </w:r>
+    </w:p>
+    <w:p>
+      <w:pPr>
+        <w:pStyle w:val="Titre2"/>
+        <w:rPr>
+          <w:color w:val="3A7C22" w:themeColor="accent6" w:themeShade="BF"/>
+        </w:rPr>
+      </w:pPr>
+      <w:r>
+        <w:rPr>
+          <w:color w:val="3A7C22" w:themeColor="accent6" w:themeShade="BF"/>
+        </w:rPr>
+        <w:lastRenderedPageBreak/>
+        <w:t xml:space="preserve">III - </w:t>
+      </w:r>
+      <w:r>
+        <w:rPr>
+          <w:color w:val="3A7C22" w:themeColor="accent6" w:themeShade="BF"/>
+        </w:rPr>
+        <w:t>Architecture</w:t>
+      </w:r>
+    </w:p>
+    <w:p>
+      <w:r>
+        <w:tab/>
+        <w:t xml:space="preserve">Le projet Fao sera composé de quatre parties distinctes : </w:t>
+      </w:r>
+    </w:p>
+    <w:p>
+      <w:pPr>
+        <w:pStyle w:val="Paragraphedeliste"/>
+        <w:numPr>
+          <w:ilvl w:val="0"/>
+          <w:numId w:val="34"/>
+        </w:numPr>
+      </w:pPr>
+      <w:r>
+        <w:t>L’interface utilisateur</w:t>
+      </w:r>
+    </w:p>
+    <w:p>
+      <w:pPr>
+        <w:pStyle w:val="Paragraphedeliste"/>
+        <w:numPr>
+          <w:ilvl w:val="0"/>
+          <w:numId w:val="34"/>
+        </w:numPr>
+      </w:pPr>
+      <w:r>
+        <w:t>L’API</w:t>
+      </w:r>
+    </w:p>
+    <w:p>
+      <w:pPr>
+        <w:pStyle w:val="Paragraphedeliste"/>
+        <w:numPr>
+          <w:ilvl w:val="0"/>
+          <w:numId w:val="34"/>
+        </w:numPr>
+      </w:pPr>
+      <w:r>
+        <w:t>Une base de données relationnelle.</w:t>
+      </w:r>
+    </w:p>
+    <w:p>
+      <w:pPr>
+        <w:pStyle w:val="Paragraphedeliste"/>
+        <w:numPr>
+          <w:ilvl w:val="0"/>
+          <w:numId w:val="34"/>
+        </w:numPr>
+      </w:pPr>
+      <w:r>
+        <w:t>Une base de données non relationnelle.</w:t>
+      </w:r>
+    </w:p>
+    <w:p>
+      <w:pPr>
+        <w:pStyle w:val="Paragraphedeliste"/>
+        <w:ind w:left="405"/>
+      </w:pPr>
+    </w:p>
+    <w:p>
+      <w:pPr>
+        <w:pStyle w:val="Titre3"/>
+        <w:rPr>
+          <w:color w:val="8DD873" w:themeColor="accent6" w:themeTint="99"/>
+        </w:rPr>
+      </w:pPr>
+      <w:r>
+        <w:rPr>
+          <w:color w:val="8DD873" w:themeColor="accent6" w:themeTint="99"/>
+        </w:rPr>
+        <w:t>A – Front-End</w:t>
+      </w:r>
+    </w:p>
+    <w:p>
+      <w:r>
+        <w:tab/>
+      </w:r>
+      <w:r>
+        <w:t>La partie Front-End de l’application s’appuie sur ASP.NET Core en utilisant Blazor WebAssembly. L’interface fonctionne donc entièrement côté client, sous forme de PWA, ce qui permet à l’utilisateur d’accéder à l’application même avec une connexion limitée.</w:t>
+      </w:r>
+    </w:p>
+    <w:p>
+      <w:pPr>
+        <w:ind w:firstLine="708"/>
+      </w:pPr>
+      <w:r>
+        <w:t>Elle intègre un Service Worker, offrant un mode hors-ligne léger, la mise en cache des ressources statiques et la conservation des dernières données consultées.</w:t>
+      </w:r>
+    </w:p>
+    <w:p>
+      <w:pPr>
+        <w:ind w:firstLine="708"/>
+      </w:pPr>
+      <w:r>
+        <w:t xml:space="preserve">L’authentification </w:t>
+      </w:r>
+      <w:r>
+        <w:t>est basée</w:t>
+      </w:r>
+      <w:r>
+        <w:t xml:space="preserve"> sur un système JWT Bearer, garantissant une gestion sécurisée des sessions entre le </w:t>
+      </w:r>
+      <w:r>
+        <w:t>Front-end</w:t>
+      </w:r>
+      <w:r>
+        <w:t xml:space="preserve"> et l’API.</w:t>
+      </w:r>
+    </w:p>
+    <w:p>
+      <w:pPr>
+        <w:ind w:firstLine="708"/>
+      </w:pPr>
+    </w:p>
+    <w:p>
+      <w:pPr>
+        <w:pStyle w:val="Titre3"/>
+        <w:rPr>
+          <w:color w:val="8DD873" w:themeColor="accent6" w:themeTint="99"/>
+        </w:rPr>
+      </w:pPr>
+      <w:r>
+        <w:rPr>
+          <w:color w:val="8DD873" w:themeColor="accent6" w:themeTint="99"/>
+        </w:rPr>
+        <w:t>B – Back-End</w:t>
+      </w:r>
+    </w:p>
+    <w:p>
+      <w:pPr>
+        <w:ind w:firstLine="708"/>
+      </w:pPr>
+      <w:r>
+        <w:t xml:space="preserve">La partie Back-End repose sur ASP.NET Core 9 et expose une API REST permettant l’échange de données avec le </w:t>
+      </w:r>
+      <w:r>
+        <w:t>Front-end</w:t>
+      </w:r>
+      <w:r>
+        <w:t>. Le système intègre SignalR pour assurer une messagerie en temps réel, Swagger pour la documentation OpenAPI et les tests d’end</w:t>
+      </w:r>
+      <w:r>
+        <w:t>-</w:t>
+      </w:r>
+      <w:r>
+        <w:t>points, ainsi qu’ASP.NET Identity pour la gestion complète des comptes et des rôles.</w:t>
+      </w:r>
+    </w:p>
+    <w:p>
+      <w:pPr>
+        <w:ind w:firstLine="708"/>
+      </w:pPr>
+    </w:p>
+    <w:p>
+      <w:pPr>
+        <w:pStyle w:val="Titre3"/>
+        <w:rPr>
+          <w:color w:val="8DD873" w:themeColor="accent6" w:themeTint="99"/>
+        </w:rPr>
+      </w:pPr>
+      <w:r>
+        <w:rPr>
+          <w:color w:val="8DD873" w:themeColor="accent6" w:themeTint="99"/>
+        </w:rPr>
+        <w:t xml:space="preserve">C – </w:t>
+      </w:r>
+      <w:r>
+        <w:rPr>
+          <w:color w:val="8DD873" w:themeColor="accent6" w:themeTint="99"/>
+        </w:rPr>
+        <w:t>Gestion et conservation des données</w:t>
+      </w:r>
+    </w:p>
+    <w:p>
+      <w:pPr>
+        <w:ind w:firstLine="405"/>
+      </w:pPr>
+      <w:r>
+        <w:t>La gestion des données repose sur deux systèmes de bases de données complémentaires :</w:t>
+      </w:r>
+    </w:p>
+    <w:p>
+      <w:pPr>
+        <w:pStyle w:val="Paragraphedeliste"/>
+        <w:numPr>
+          <w:ilvl w:val="0"/>
+          <w:numId w:val="34"/>
+        </w:numPr>
+      </w:pPr>
+      <w:r>
+        <w:t xml:space="preserve">Une base SQL, gérée par SQL Server. </w:t>
+      </w:r>
+    </w:p>
+    <w:p>
+      <w:pPr>
+        <w:pStyle w:val="Paragraphedeliste"/>
+        <w:numPr>
+          <w:ilvl w:val="1"/>
+          <w:numId w:val="34"/>
+        </w:numPr>
+      </w:pPr>
+      <w:r>
+        <w:t xml:space="preserve">Du côté du framework, la communication entre l’API et la base passe par Entity Framework, qui </w:t>
+      </w:r>
+      <w:r>
+        <w:t xml:space="preserve">vérifie </w:t>
+      </w:r>
+      <w:r>
+        <w:t xml:space="preserve"> la cohérence entre les modèles et les tables, ainsi que la gestion des migrations.</w:t>
+      </w:r>
+    </w:p>
+    <w:p>
+      <w:pPr>
+        <w:pStyle w:val="Paragraphedeliste"/>
+        <w:numPr>
+          <w:ilvl w:val="0"/>
+          <w:numId w:val="34"/>
+        </w:numPr>
+      </w:pPr>
+      <w:r>
+        <w:t>Une base NoSQL, gérée par MongoDB.</w:t>
+      </w:r>
+    </w:p>
+    <w:p>
+      <w:pPr>
+        <w:pStyle w:val="Paragraphedeliste"/>
+        <w:numPr>
+          <w:ilvl w:val="1"/>
+          <w:numId w:val="34"/>
+        </w:numPr>
+      </w:pPr>
+      <w:r>
+        <w:t>L’accès aux documents se fait via le MongoDB Driver, qui permet d’interagir avec les collections et de manipuler les données non structurées.</w:t>
+      </w:r>
+    </w:p>
+    <w:p>
+      <w:pPr>
+        <w:pStyle w:val="Paragraphedeliste"/>
+        <w:ind w:left="405"/>
+      </w:pPr>
+    </w:p>
+    <w:p>
+      <w:pPr>
+        <w:pStyle w:val="Titre2"/>
+        <w:rPr>
+          <w:color w:val="3A7C22" w:themeColor="accent6" w:themeShade="BF"/>
+        </w:rPr>
+      </w:pPr>
+      <w:r>
+        <w:rPr>
+          <w:color w:val="3A7C22" w:themeColor="accent6" w:themeShade="BF"/>
+        </w:rPr>
+        <w:lastRenderedPageBreak/>
+        <w:t xml:space="preserve">IV - </w:t>
+      </w:r>
+      <w:r>
+        <w:rPr>
+          <w:color w:val="3A7C22" w:themeColor="accent6" w:themeShade="BF"/>
+        </w:rPr>
+        <w:t>Infra</w:t>
+      </w:r>
+      <w:r>
+        <w:rPr>
+          <w:color w:val="3A7C22" w:themeColor="accent6" w:themeShade="BF"/>
+        </w:rPr>
+        <w:t>structure et d</w:t>
+      </w:r>
+      <w:r>
+        <w:rPr>
+          <w:color w:val="3A7C22" w:themeColor="accent6" w:themeShade="BF"/>
+        </w:rPr>
+        <w:t>éploiement</w:t>
+      </w:r>
+    </w:p>
+    <w:p>
+      <w:pPr>
+        <w:ind w:firstLine="708"/>
+      </w:pPr>
+      <w:r>
+        <w:t>L’application est déployée sous forme d’une architecture conteneurisée, comprenant trois éléments principaux :</w:t>
+      </w:r>
+    </w:p>
+    <w:p>
+      <w:pPr>
+        <w:pStyle w:val="Paragraphedeliste"/>
+        <w:numPr>
+          <w:ilvl w:val="0"/>
+          <w:numId w:val="34"/>
+        </w:numPr>
+        <w:rPr>
+          <w:lang w:val="en-US"/>
+        </w:rPr>
+      </w:pPr>
+      <w:r>
+        <w:rPr>
+          <w:lang w:val="en-US"/>
+        </w:rPr>
+        <w:t>Front-End PWA (Blazor WebAssembly)</w:t>
+      </w:r>
+    </w:p>
+    <w:p>
+      <w:pPr>
+        <w:pStyle w:val="Paragraphedeliste"/>
+        <w:numPr>
+          <w:ilvl w:val="0"/>
+          <w:numId w:val="34"/>
+        </w:numPr>
+        <w:rPr>
+          <w:lang w:val="en-US"/>
+        </w:rPr>
+      </w:pPr>
+      <w:r>
+        <w:rPr>
+          <w:lang w:val="en-US"/>
+        </w:rPr>
+        <w:t>Back-End API (ASP.NET Core)</w:t>
+      </w:r>
+    </w:p>
+    <w:p>
+      <w:pPr>
+        <w:pStyle w:val="Paragraphedeliste"/>
+        <w:numPr>
+          <w:ilvl w:val="0"/>
+          <w:numId w:val="34"/>
+        </w:numPr>
+      </w:pPr>
+      <w:r>
+        <w:t>Bases de données : SQL Server (relationnel) et MongoDB (NoSQL)</w:t>
+      </w:r>
+    </w:p>
+    <w:p>
+      <w:pPr>
+        <w:ind w:firstLine="405"/>
+      </w:pPr>
+      <w:r>
+        <w:t>L’ensemble des services est orchestré via Docker et exposé à travers un serveur Nginx, utilisé comme reverse proxy.</w:t>
+      </w:r>
+    </w:p>
+    <w:p>
+      <w:pPr>
+        <w:ind w:firstLine="405"/>
+      </w:pPr>
+      <w:r>
+        <w:t>Ce dernier gère le HTTPS, la mise en cache, ainsi que le fallback SPA</w:t>
+      </w:r>
+      <w:r>
+        <w:t>(Simple Page Application)</w:t>
+      </w:r>
+      <w:r>
+        <w:t>, nécessaire au bon fonctionnement de Blazor WebAssembly</w:t>
+      </w:r>
+      <w:r>
+        <w:t>.</w:t>
+      </w:r>
+    </w:p>
+    <w:p>
+      <w:pPr>
+        <w:pStyle w:val="Titre3"/>
+        <w:rPr>
+          <w:color w:val="8DD873" w:themeColor="accent6" w:themeTint="99"/>
+        </w:rPr>
+      </w:pPr>
+      <w:r>
+        <w:rPr>
+          <w:color w:val="8DD873" w:themeColor="accent6" w:themeTint="99"/>
+        </w:rPr>
+        <w:t xml:space="preserve">A </w:t>
+      </w:r>
+      <w:r>
+        <w:rPr>
+          <w:color w:val="8DD873" w:themeColor="accent6" w:themeTint="99"/>
+        </w:rPr>
+        <w:t>–</w:t>
+      </w:r>
+      <w:r>
+        <w:rPr>
+          <w:color w:val="8DD873" w:themeColor="accent6" w:themeTint="99"/>
+        </w:rPr>
+        <w:t xml:space="preserve"> </w:t>
+      </w:r>
+      <w:r>
+        <w:rPr>
+          <w:color w:val="8DD873" w:themeColor="accent6" w:themeTint="99"/>
+        </w:rPr>
+        <w:t>Front-End (PWA)</w:t>
+      </w:r>
+    </w:p>
+    <w:p>
+      <w:pPr>
+        <w:ind w:firstLine="708"/>
+      </w:pPr>
+      <w:r>
+        <w:t>Le front-end Blazor Wasm est compilé avec</w:t>
+      </w:r>
+      <w:r>
+        <w:t xml:space="preserve"> la commande</w:t>
+      </w:r>
+      <w:r>
+        <w:t xml:space="preserve"> </w:t>
+      </w:r>
+      <w:r>
+        <w:t>« </w:t>
+      </w:r>
+      <w:r>
+        <w:rPr>
+          <w:i/>
+          <w:iCs/>
+        </w:rPr>
+        <w:t>dotnet publish</w:t>
+      </w:r>
+      <w:r>
+        <w:t> »</w:t>
+      </w:r>
+      <w:r>
+        <w:t>.</w:t>
+      </w:r>
+      <w:r>
+        <w:t xml:space="preserve"> </w:t>
+      </w:r>
+      <w:r>
+        <w:t xml:space="preserve">Les fichiers générés dans </w:t>
+      </w:r>
+      <w:r>
+        <w:t>le dossier « </w:t>
+      </w:r>
+      <w:r>
+        <w:rPr>
+          <w:i/>
+          <w:iCs/>
+        </w:rPr>
+        <w:t>wwwroot</w:t>
+      </w:r>
+      <w:r>
+        <w:t> »</w:t>
+      </w:r>
+      <w:r>
+        <w:t xml:space="preserve"> sont ensuite servis directement par l’API.</w:t>
+      </w:r>
+    </w:p>
+    <w:p>
+      <w:pPr>
+        <w:ind w:firstLine="405"/>
+      </w:pPr>
+      <w:r>
+        <w:t>Cette configuration permet :</w:t>
+      </w:r>
+    </w:p>
+    <w:p>
+      <w:pPr>
+        <w:pStyle w:val="Paragraphedeliste"/>
+        <w:numPr>
+          <w:ilvl w:val="0"/>
+          <w:numId w:val="34"/>
+        </w:numPr>
+      </w:pPr>
+      <w:r>
+        <w:t>D’éviter</w:t>
+      </w:r>
+      <w:r>
+        <w:t xml:space="preserve"> les problèmes de CORS</w:t>
+      </w:r>
+      <w:r>
+        <w:t xml:space="preserve"> (Cross Origin</w:t>
+      </w:r>
+      <w:r>
+        <w:t xml:space="preserve"> Resource Sha</w:t>
+      </w:r>
+      <w:r>
+        <w:t>)</w:t>
+      </w:r>
+      <w:r>
+        <w:t>,</w:t>
+      </w:r>
+    </w:p>
+    <w:p>
+      <w:pPr>
+        <w:pStyle w:val="Paragraphedeliste"/>
+        <w:numPr>
+          <w:ilvl w:val="0"/>
+          <w:numId w:val="34"/>
+        </w:numPr>
+      </w:pPr>
+      <w:r>
+        <w:t>De</w:t>
+      </w:r>
+      <w:r>
+        <w:t xml:space="preserve"> garantir le fonctionnement PWA (offline, cache),</w:t>
+      </w:r>
+    </w:p>
+    <w:p>
+      <w:pPr>
+        <w:pStyle w:val="Paragraphedeliste"/>
+        <w:numPr>
+          <w:ilvl w:val="0"/>
+          <w:numId w:val="34"/>
+        </w:numPr>
+      </w:pPr>
+      <w:r>
+        <w:t>D</w:t>
+      </w:r>
+      <w:r>
+        <w:t>’exposer l’application via un seul domaine.</w:t>
+      </w:r>
+    </w:p>
+    <w:p/>
+    <w:p>
+      <w:pPr>
+        <w:pStyle w:val="Titre3"/>
+        <w:rPr>
+          <w:color w:val="8DD873" w:themeColor="accent6" w:themeTint="99"/>
+        </w:rPr>
+      </w:pPr>
+      <w:r>
+        <w:rPr>
+          <w:color w:val="8DD873" w:themeColor="accent6" w:themeTint="99"/>
+        </w:rPr>
+        <w:t xml:space="preserve">B - </w:t>
+      </w:r>
+      <w:r>
+        <w:rPr>
+          <w:color w:val="8DD873" w:themeColor="accent6" w:themeTint="99"/>
+        </w:rPr>
+        <w:t>Back-End (API)</w:t>
+      </w:r>
+    </w:p>
+    <w:p>
+      <w:pPr>
+        <w:ind w:firstLine="708"/>
+      </w:pPr>
+      <w:r>
+        <w:t>L’API ASP.NET Core est publiée puis intégrée dans une image Docker.</w:t>
+      </w:r>
+      <w:r>
+        <w:t xml:space="preserve"> </w:t>
+      </w:r>
+      <w:r>
+        <w:t xml:space="preserve">Elle s’exécute </w:t>
+      </w:r>
+      <w:r>
+        <w:t>en s’appuyant sur un serveur</w:t>
+      </w:r>
+      <w:r>
+        <w:t xml:space="preserve"> Nginx et communique avec les bases de données via un réseau interne Docker.</w:t>
+      </w:r>
+    </w:p>
+    <w:p>
+      <w:pPr>
+        <w:ind w:firstLine="708"/>
+      </w:pPr>
+      <w:r>
+        <w:t>Kestrel sert les fichiers statiques du front et expose les end</w:t>
+      </w:r>
+      <w:r>
+        <w:t>-</w:t>
+      </w:r>
+      <w:r>
+        <w:t>points REST sécurisés par JWT.</w:t>
+      </w:r>
+    </w:p>
+    <w:p/>
+    <w:p>
+      <w:pPr>
+        <w:pStyle w:val="Titre3"/>
+        <w:rPr>
+          <w:color w:val="8DD873" w:themeColor="accent6" w:themeTint="99"/>
+        </w:rPr>
+      </w:pPr>
+      <w:r>
+        <w:rPr>
+          <w:color w:val="8DD873" w:themeColor="accent6" w:themeTint="99"/>
+        </w:rPr>
+        <w:t xml:space="preserve">C - </w:t>
+      </w:r>
+      <w:r>
+        <w:rPr>
+          <w:color w:val="8DD873" w:themeColor="accent6" w:themeTint="99"/>
+        </w:rPr>
+        <w:t>Bases de Données</w:t>
+      </w:r>
+    </w:p>
+    <w:p>
+      <w:pPr>
+        <w:ind w:firstLine="708"/>
+      </w:pPr>
+      <w:r>
+        <w:t>Deux conteneurs</w:t>
+      </w:r>
+      <w:r>
+        <w:t xml:space="preserve"> sont</w:t>
+      </w:r>
+      <w:r>
+        <w:t xml:space="preserve"> dédiés </w:t>
+      </w:r>
+      <w:r>
+        <w:t xml:space="preserve">pour assurer </w:t>
+      </w:r>
+      <w:r>
+        <w:t xml:space="preserve">la persistance </w:t>
+      </w:r>
+      <w:r>
+        <w:t>des données</w:t>
+      </w:r>
+      <w:r>
+        <w:t xml:space="preserve"> :</w:t>
+      </w:r>
+    </w:p>
+    <w:p>
+      <w:pPr>
+        <w:pStyle w:val="Paragraphedeliste"/>
+        <w:numPr>
+          <w:ilvl w:val="0"/>
+          <w:numId w:val="34"/>
+        </w:numPr>
+      </w:pPr>
+      <w:r>
+        <w:t>SQL Server : données structurées (utilisateurs, recettes, planning, progrès…).</w:t>
+      </w:r>
+    </w:p>
+    <w:p>
+      <w:pPr>
+        <w:pStyle w:val="Paragraphedeliste"/>
+        <w:numPr>
+          <w:ilvl w:val="0"/>
+          <w:numId w:val="34"/>
+        </w:numPr>
+      </w:pPr>
+      <w:r>
+        <w:t>MongoDB : données non structurées (</w:t>
+      </w:r>
+      <w:r>
+        <w:t>Données statistiques, log)</w:t>
+      </w:r>
+      <w:r>
+        <w:t>.</w:t>
+      </w:r>
+    </w:p>
+    <w:p>
+      <w:pPr>
+        <w:ind w:firstLine="708"/>
+      </w:pPr>
+      <w:r>
+        <w:t>Chacun utilise un volume Docker pour la persistance des données.</w:t>
+      </w:r>
+    </w:p>
+    <w:p>
+      <w:r>
+        <w:br w:type="page"/>
+      </w:r>
+    </w:p>
+    <w:p>
+      <w:pPr>
+        <w:pStyle w:val="Titre3"/>
+        <w:rPr>
+          <w:color w:val="8DD873" w:themeColor="accent6" w:themeTint="99"/>
+        </w:rPr>
+      </w:pPr>
+      <w:r>
+        <w:rPr>
+          <w:color w:val="8DD873" w:themeColor="accent6" w:themeTint="99"/>
+        </w:rPr>
+        <w:lastRenderedPageBreak/>
+        <w:t xml:space="preserve">D - </w:t>
+      </w:r>
+      <w:r>
+        <w:rPr>
+          <w:color w:val="8DD873" w:themeColor="accent6" w:themeTint="99"/>
+        </w:rPr>
+        <w:t>Hébergement</w:t>
+      </w:r>
+    </w:p>
+    <w:p>
+      <w:pPr>
+        <w:ind w:firstLine="708"/>
+      </w:pPr>
+      <w:r>
+        <w:t xml:space="preserve">L’infrastructure est conçue pour être déployée sur un VPS </w:t>
+      </w:r>
+      <w:r>
+        <w:t>(Virtual</w:t>
+      </w:r>
+      <w:r>
+        <w:t xml:space="preserve"> Private Server) </w:t>
+      </w:r>
+      <w:r>
+        <w:t>avec :</w:t>
+      </w:r>
+    </w:p>
+    <w:p>
+      <w:pPr>
+        <w:pStyle w:val="Paragraphedeliste"/>
+        <w:numPr>
+          <w:ilvl w:val="0"/>
+          <w:numId w:val="34"/>
+        </w:numPr>
+      </w:pPr>
+      <w:r>
+        <w:t>Docker + docker-compose</w:t>
+      </w:r>
+    </w:p>
+    <w:p>
+      <w:pPr>
+        <w:pStyle w:val="Paragraphedeliste"/>
+        <w:numPr>
+          <w:ilvl w:val="0"/>
+          <w:numId w:val="34"/>
+        </w:numPr>
+      </w:pPr>
+      <w:r>
+        <w:t>Nginx en reverse proxy</w:t>
+      </w:r>
+    </w:p>
+    <w:p>
+      <w:pPr>
+        <w:pStyle w:val="Paragraphedeliste"/>
+        <w:numPr>
+          <w:ilvl w:val="0"/>
+          <w:numId w:val="34"/>
+        </w:numPr>
+      </w:pPr>
+      <w:r>
+        <w:t>Certificats HTTPS (Let’s Encrypt)</w:t>
+      </w:r>
+    </w:p>
+    <w:p>
+      <w:pPr>
+        <w:ind w:firstLine="708"/>
+      </w:pPr>
+      <w:r>
+        <w:t>Cette solution est robuste, professionnelle, reproductible, et adaptée à une application Web moderne.</w:t>
+      </w:r>
+    </w:p>
+    <w:p>
+      <w:pPr>
+        <w:ind w:firstLine="708"/>
+        <w:jc w:val="center"/>
+        <w:rPr>
+          <w:i/>
+          <w:iCs/>
+          <w:color w:val="3A7C22" w:themeColor="accent6" w:themeShade="BF"/>
+        </w:rPr>
+      </w:pPr>
+      <w:r>
+        <w:rPr>
+          <w:i/>
+          <w:iCs/>
+          <w:noProof/>
+          <w:color w:val="3A7C22" w:themeColor="accent6" w:themeShade="BF"/>
+        </w:rPr>
+        <w:drawing>
+          <wp:anchor distT="0" distB="0" distL="114300" distR="114300" simplePos="0" relativeHeight="251658240" behindDoc="1" locked="0" layoutInCell="1" allowOverlap="1" wp14:anchorId="2C88801C" wp14:editId="0690A54B">
+            <wp:simplePos x="0" y="0"/>
+            <wp:positionH relativeFrom="margin">
+              <wp:align>right</wp:align>
+            </wp:positionH>
+            <wp:positionV relativeFrom="paragraph">
+              <wp:posOffset>306070</wp:posOffset>
+            </wp:positionV>
+            <wp:extent cx="5759450" cy="4610100"/>
+            <wp:effectExtent l="0" t="0" r="0" b="0"/>
+            <wp:wrapTopAndBottom/>
+            <wp:docPr id="732635632" name="Image 1"/>
+            <wp:cNvGraphicFramePr>
+              <a:graphicFrameLocks xmlns:a="http://schemas.openxmlformats.org/drawingml/2006/main" noChangeAspect="1"/>
+            </wp:cNvGraphicFramePr>
+            <a:graphic xmlns:a="http://schemas.openxmlformats.org/drawingml/2006/main">
+              <a:graphicData uri="http://schemas.openxmlformats.org/drawingml/2006/picture">
+                <pic:pic xmlns:pic="http://schemas.openxmlformats.org/drawingml/2006/picture">
+                  <pic:nvPicPr>
+                    <pic:cNvPr id="0" name="Picture 18"/>
+                    <pic:cNvPicPr>
+                      <a:picLocks noChangeAspect="1" noChangeArrowheads="1"/>
+                    </pic:cNvPicPr>
+                  </pic:nvPicPr>
+                  <pic:blipFill>
+                    <a:blip r:embed="rId6">
+                      <a:extLst>
+                        <a:ext uri="{28A0092B-C50C-407E-A947-70E740481C1C}">
+                          <a14:useLocalDpi xmlns:a14="http://schemas.microsoft.com/office/drawing/2010/main" val="0"/>
+                        </a:ext>
+                      </a:extLst>
+                    </a:blip>
+                    <a:srcRect/>
+                    <a:stretch>
+                      <a:fillRect/>
+                    </a:stretch>
+                  </pic:blipFill>
+                  <pic:spPr bwMode="auto">
+                    <a:xfrm>
+                      <a:off x="0" y="0"/>
+                      <a:ext cx="5759450" cy="4610100"/>
+                    </a:xfrm>
+                    <a:prstGeom prst="rect">
+                      <a:avLst/>
+                    </a:prstGeom>
+                    <a:noFill/>
+                    <a:ln>
+                      <a:noFill/>
+                    </a:ln>
+                  </pic:spPr>
+                </pic:pic>
+              </a:graphicData>
+            </a:graphic>
+          </wp:anchor>
+        </w:drawing>
+      </w:r>
+      <w:r>
+        <w:rPr>
+          <w:i/>
+          <w:iCs/>
+          <w:color w:val="3A7C22" w:themeColor="accent6" w:themeShade="BF"/>
+        </w:rPr>
+        <w:t xml:space="preserve">Schéma logique et simplifié de </w:t>
+      </w:r>
+      <w:r>
+        <w:rPr>
+          <w:i/>
+          <w:iCs/>
+          <w:color w:val="3A7C22" w:themeColor="accent6" w:themeShade="BF"/>
+        </w:rPr>
+        <w:t>l’infrastructure</w:t>
+      </w:r>
+      <w:r>
+        <w:rPr>
+          <w:i/>
+          <w:iCs/>
+          <w:color w:val="3A7C22" w:themeColor="accent6" w:themeShade="BF"/>
+        </w:rPr>
+        <w:t xml:space="preserve"> de l’application</w:t>
+      </w:r>
+    </w:p>
+    <w:p>
+      <w:r>
+        <w:br w:type="page"/>
+      </w:r>
+    </w:p>
+    <w:p>
+      <w:pPr>
+        <w:pStyle w:val="Titre2"/>
+        <w:rPr>
+          <w:color w:val="3A7C22" w:themeColor="accent6" w:themeShade="BF"/>
+        </w:rPr>
+      </w:pPr>
+      <w:r>
+        <w:rPr>
+          <w:color w:val="3A7C22" w:themeColor="accent6" w:themeShade="BF"/>
+        </w:rPr>
+        <w:lastRenderedPageBreak/>
+        <w:t xml:space="preserve">IV - </w:t>
+      </w:r>
+      <w:r>
+        <w:rPr>
+          <w:color w:val="3A7C22" w:themeColor="accent6" w:themeShade="BF"/>
+        </w:rPr>
+        <w:t>Modèle de données</w:t>
+      </w:r>
+    </w:p>
+    <w:p>
+      <w:pPr>
+        <w:pStyle w:val="Titre3"/>
+        <w:rPr>
+          <w:color w:val="8DD873" w:themeColor="accent6" w:themeTint="99"/>
+        </w:rPr>
+      </w:pPr>
+      <w:r>
+        <w:rPr>
+          <w:color w:val="8DD873" w:themeColor="accent6" w:themeTint="99"/>
+        </w:rPr>
+        <w:t>A -</w:t>
+      </w:r>
+      <w:r>
+        <w:rPr>
+          <w:color w:val="8DD873" w:themeColor="accent6" w:themeTint="99"/>
+        </w:rPr>
+        <w:t xml:space="preserve"> SQL Server </w:t>
+      </w:r>
+    </w:p>
+    <w:p>
+      <w:r>
+        <w:t>Voici la liste des modèles utilisés pour la persistance des données </w:t>
+      </w:r>
+      <w:r>
+        <w:t>dans la base de données SQL Server</w:t>
+      </w:r>
+      <w:r>
+        <w:t>:</w:t>
+      </w:r>
+    </w:p>
+    <w:p>
+      <w:r>
         <w:rPr>
           <w:b/>
           <w:bCs/>
         </w:rPr>
-      </w:pPr>
+        <w:t>Users</w:t>
+      </w:r>
+      <w:r>
+        <w:t xml:space="preserve"> (AspNetUsers étendu)</w:t>
+      </w:r>
+    </w:p>
+    <w:p>
+      <w:pPr>
+        <w:numPr>
+          <w:ilvl w:val="0"/>
+          <w:numId w:val="6"/>
+        </w:numPr>
+      </w:pPr>
+      <w:r>
+        <w:t>Id (GUID PK)</w:t>
+      </w:r>
+    </w:p>
+    <w:p>
+      <w:pPr>
+        <w:numPr>
+          <w:ilvl w:val="0"/>
+          <w:numId w:val="6"/>
+        </w:numPr>
+      </w:pPr>
+      <w:r>
+        <w:t>UUID (CHAR(36))</w:t>
+      </w:r>
+    </w:p>
+    <w:p>
+      <w:pPr>
+        <w:numPr>
+          <w:ilvl w:val="0"/>
+          <w:numId w:val="6"/>
+        </w:numPr>
+      </w:pPr>
+      <w:r>
+        <w:t>Email (unique), PasswordHash,</w:t>
+      </w:r>
+    </w:p>
+    <w:p>
+      <w:pPr>
+        <w:numPr>
+          <w:ilvl w:val="0"/>
+          <w:numId w:val="6"/>
+        </w:numPr>
+      </w:pPr>
+      <w:r>
+        <w:t xml:space="preserve">Role (enum/IdentityRole : </w:t>
+      </w:r>
       <w:r>
         <w:rPr>
           <w:b/>
           <w:bCs/>
         </w:rPr>
-        <w:lastRenderedPageBreak/>
-        <w:t>1) Présentation &amp; Objectifs</w:t>
-      </w:r>
-    </w:p>
-    <w:p>
+        <w:t>PARTICULIER</w:t>
+      </w:r>
+      <w:r>
+        <w:t xml:space="preserve">, </w:t>
+      </w:r>
       <w:r>
         <w:rPr>
           <w:b/>
           <w:bCs/>
         </w:rPr>
-        <w:t>Nom de code :</w:t>
-      </w:r>
-      <w:r>
-        <w:t xml:space="preserve"> Projet Fao</w:t>
-      </w:r>
-    </w:p>
-    <w:p>
+        <w:t>COACH</w:t>
+      </w:r>
+      <w:r>
+        <w:t xml:space="preserve">, </w:t>
+      </w:r>
       <w:r>
         <w:rPr>
           <w:b/>
           <w:bCs/>
         </w:rPr>
-        <w:t>Pitch :</w:t>
-      </w:r>
-      <w:r>
-        <w:t xml:space="preserve"> Application web/mobile (PWA) de mise en relation entre des coachs en nutrition et des particuliers. Les coachs conçoivent des plannings de repas personnalisés, suivent les progrès des utilisateurs (mensurations, poids, photos, notes libres) et échangent via une messagerie. Les particuliers consultent leur planning, recettes, peuvent proposer des substitutions depuis une base de recettes « healthy », dialoguer avec leur coach et gérer leur profil.</w:t>
-      </w:r>
-    </w:p>
-    <w:p>
-      <w:r>
+        <w:t>ADMIN</w:t>
+      </w:r>
+      <w:r>
+        <w:t>)</w:t>
+      </w:r>
+    </w:p>
+    <w:p>
+      <w:pPr>
+        <w:numPr>
+          <w:ilvl w:val="0"/>
+          <w:numId w:val="6"/>
+        </w:numPr>
+      </w:pPr>
+      <w:r>
+        <w:t>Firstname,lastname,gender,birthdate</w:t>
+      </w:r>
+    </w:p>
+    <w:p>
+      <w:pPr>
+        <w:numPr>
+          <w:ilvl w:val="0"/>
+          <w:numId w:val="6"/>
+        </w:numPr>
+      </w:pPr>
+      <w:r>
+        <w:t>Size,weight</w:t>
+      </w:r>
+    </w:p>
+    <w:p>
+      <w:pPr>
+        <w:numPr>
+          <w:ilvl w:val="0"/>
+          <w:numId w:val="6"/>
+        </w:numPr>
+      </w:pPr>
+      <w:r>
+        <w:t>Physical_activity,job</w:t>
+      </w:r>
+    </w:p>
+    <w:p>
+      <w:pPr>
+        <w:numPr>
+          <w:ilvl w:val="0"/>
+          <w:numId w:val="6"/>
+        </w:numPr>
+      </w:pPr>
+      <w:r>
+        <w:t>Energy_requirement</w:t>
+      </w:r>
+    </w:p>
+    <w:p>
+      <w:pPr>
+        <w:numPr>
+          <w:ilvl w:val="0"/>
+          <w:numId w:val="6"/>
+        </w:numPr>
+      </w:pPr>
+      <w:r>
+        <w:t>CreatedAt, LastLogin</w:t>
+      </w:r>
+    </w:p>
+    <w:p>
+      <w:pPr>
         <w:rPr>
           <w:b/>
           <w:bCs/>
         </w:rPr>
-        <w:t>Publics :</w:t>
-      </w:r>
-    </w:p>
-    <w:p>
-      <w:pPr>
-        <w:numPr>
-          <w:ilvl w:val="0"/>
-          <w:numId w:val="1"/>
-        </w:numPr>
       </w:pPr>
       <w:r>
         <w:rPr>
           <w:b/>
           <w:bCs/>
         </w:rPr>
-        <w:t>Particulier</w:t>
-      </w:r>
-      <w:r>
-        <w:t xml:space="preserve"> (utilisateur final)</w:t>
-      </w:r>
-    </w:p>
-    <w:p>
-      <w:pPr>
-        <w:numPr>
-          <w:ilvl w:val="0"/>
-          <w:numId w:val="1"/>
-        </w:numPr>
-      </w:pPr>
+        <w:t>Rol</w:t>
+      </w:r>
       <w:r>
         <w:rPr>
           <w:b/>
           <w:bCs/>
         </w:rPr>
-        <w:t>Coach</w:t>
-      </w:r>
-      <w:r>
-        <w:t xml:space="preserve"> (professionnel</w:t>
-      </w:r>
-    </w:p>
-    <w:p>
-      <w:pPr>
-        <w:numPr>
-          <w:ilvl w:val="0"/>
-          <w:numId w:val="1"/>
-        </w:numPr>
-      </w:pPr>
+        <w:t>es</w:t>
+      </w:r>
+    </w:p>
+    <w:p>
+      <w:pPr>
+        <w:pStyle w:val="Paragraphedeliste"/>
+        <w:numPr>
+          <w:ilvl w:val="0"/>
+          <w:numId w:val="33"/>
+        </w:numPr>
+      </w:pPr>
+      <w:r>
+        <w:t>Id(PK)</w:t>
+      </w:r>
+    </w:p>
+    <w:p>
+      <w:pPr>
+        <w:pStyle w:val="Paragraphedeliste"/>
+        <w:numPr>
+          <w:ilvl w:val="0"/>
+          <w:numId w:val="33"/>
+        </w:numPr>
+      </w:pPr>
+      <w:r>
+        <w:t>Name VARCHAR(255)</w:t>
+      </w:r>
+    </w:p>
+    <w:p>
       <w:r>
         <w:rPr>
           <w:b/>
           <w:bCs/>
         </w:rPr>
-        <w:t>Admin</w:t>
-      </w:r>
-      <w:r>
-        <w:t xml:space="preserve"> (opérationnel — back</w:t>
-      </w:r>
-      <w:r>
-        <w:noBreakHyphen/>
-        <w:t>office minimal)</w:t>
+        <w:t>MealPlan</w:t>
+      </w:r>
+    </w:p>
+    <w:p>
+      <w:pPr>
+        <w:numPr>
+          <w:ilvl w:val="0"/>
+          <w:numId w:val="9"/>
+        </w:numPr>
+        <w:rPr>
+          <w:lang w:val="en-US"/>
+        </w:rPr>
+      </w:pPr>
+      <w:r>
+        <w:rPr>
+          <w:lang w:val="en-US"/>
+        </w:rPr>
+        <w:t>Id, ClientId, CoachId, WeekStart (date ISO), Notes</w:t>
       </w:r>
     </w:p>
     <w:p>
@@ -205,1216 +1815,441 @@
           <w:b/>
           <w:bCs/>
         </w:rPr>
-        <w:t>KPIs clés :</w:t>
-      </w:r>
-      <w:r>
-        <w:t xml:space="preserve"> temps de réponse API &lt; 300 ms P95, disponibilité 99.5 %, TTFB &lt; 1 s côté UI, taux de messages lus &gt; 90 %, taux d’adhésion PWA &gt; 60 %.</w:t>
-      </w:r>
-    </w:p>
-    <w:p>
-      <w:r>
-        <w:pict w14:anchorId="670460D3">
-          <v:rect id="_x0000_i1025" style="width:0;height:1.5pt" o:hralign="center" o:hrstd="t" o:hr="t" fillcolor="#a0a0a0" stroked="f"/>
-        </w:pict>
-      </w:r>
-    </w:p>
-    <w:p>
-      <w:pPr>
+        <w:t>MealDay</w:t>
+      </w:r>
+    </w:p>
+    <w:p>
+      <w:pPr>
+        <w:numPr>
+          <w:ilvl w:val="0"/>
+          <w:numId w:val="10"/>
+        </w:numPr>
+      </w:pPr>
+      <w:r>
+        <w:t>Id, MealPlanId, Date</w:t>
+      </w:r>
+    </w:p>
+    <w:p>
+      <w:r>
         <w:rPr>
           <w:b/>
           <w:bCs/>
         </w:rPr>
-      </w:pPr>
+        <w:t>MealSlot</w:t>
+      </w:r>
+    </w:p>
+    <w:p>
+      <w:pPr>
+        <w:numPr>
+          <w:ilvl w:val="0"/>
+          <w:numId w:val="11"/>
+        </w:numPr>
+        <w:rPr>
+          <w:lang w:val="en-US"/>
+        </w:rPr>
+      </w:pPr>
+      <w:r>
+        <w:rPr>
+          <w:lang w:val="en-US"/>
+        </w:rPr>
+        <w:t>Id, MealDayId, SlotType (Breakfast|Lunch|Snack|Dinner), RecipeRef (string) → pointeur vers Mongo Recettes, Substitutable (bool), Notes</w:t>
+      </w:r>
+    </w:p>
+    <w:p>
       <w:r>
         <w:rPr>
           <w:b/>
           <w:bCs/>
         </w:rPr>
-        <w:t>2) Périmètre fonctionnel</w:t>
-      </w:r>
-    </w:p>
-    <w:p>
-      <w:pPr>
+        <w:t>Consent/Audit</w:t>
+      </w:r>
+      <w:r>
+        <w:t xml:space="preserve"> (optionnel MVP+)</w:t>
+      </w:r>
+    </w:p>
+    <w:p>
+      <w:pPr>
+        <w:numPr>
+          <w:ilvl w:val="0"/>
+          <w:numId w:val="12"/>
+        </w:numPr>
+      </w:pPr>
+      <w:r>
+        <w:t>Id, UserId, Type, GivenAt, RevokedAt</w:t>
+      </w:r>
+    </w:p>
+    <w:p>
+      <w:pPr>
+        <w:rPr>
+          <w:lang w:val="en-US"/>
+        </w:rPr>
+      </w:pPr>
+      <w:r>
         <w:rPr>
           <w:b/>
           <w:bCs/>
-        </w:rPr>
-      </w:pPr>
-      <w:r>
+          <w:lang w:val="en-US"/>
+        </w:rPr>
+        <w:t>Indexation</w:t>
+      </w:r>
+      <w:r>
+        <w:rPr>
+          <w:lang w:val="en-US"/>
+        </w:rPr>
+        <w:t xml:space="preserve"> : Users(Email), CoachClient(CoachId,ClientId unique), MealPlan(ClientId,WeekStart unique), MealSlot(MealDayId,SlotType unique).</w:t>
+      </w:r>
+    </w:p>
+    <w:p>
+      <w:pPr>
         <w:rPr>
           <w:b/>
           <w:bCs/>
         </w:rPr>
-        <w:t>2.1 Particulier</w:t>
-      </w:r>
-    </w:p>
-    <w:p>
-      <w:pPr>
-        <w:numPr>
-          <w:ilvl w:val="0"/>
-          <w:numId w:val="2"/>
-        </w:numPr>
-      </w:pPr>
-      <w:r>
-        <w:t xml:space="preserve">Consulter </w:t>
-      </w:r>
+      </w:pPr>
       <w:r>
         <w:rPr>
           <w:b/>
           <w:bCs/>
         </w:rPr>
-        <w:t>planning de repas</w:t>
-      </w:r>
-      <w:r>
-        <w:t xml:space="preserve"> préparé par son coach (par jour/repas).</w:t>
-      </w:r>
-    </w:p>
-    <w:p>
-      <w:pPr>
-        <w:numPr>
-          <w:ilvl w:val="0"/>
-          <w:numId w:val="2"/>
-        </w:numPr>
-      </w:pPr>
-      <w:r>
-        <w:t xml:space="preserve">Consulter </w:t>
-      </w:r>
+        <w:t>4.2 MongoDB (extrait)</w:t>
+      </w:r>
+    </w:p>
+    <w:p>
       <w:r>
         <w:rPr>
           <w:b/>
           <w:bCs/>
         </w:rPr>
-        <w:t>recettes</w:t>
-      </w:r>
-      <w:r>
-        <w:t xml:space="preserve"> (ingrédients, étapes, macros).</w:t>
-      </w:r>
-    </w:p>
-    <w:p>
-      <w:pPr>
-        <w:numPr>
-          <w:ilvl w:val="0"/>
-          <w:numId w:val="2"/>
-        </w:numPr>
+        <w:lastRenderedPageBreak/>
+        <w:t>recipes</w:t>
+      </w:r>
+    </w:p>
+    <w:p>
+      <w:r>
+        <w:t>{</w:t>
+      </w:r>
+    </w:p>
+    <w:p>
+      <w:r>
+        <w:t xml:space="preserve">  "_id": ObjectId,</w:t>
+      </w:r>
+    </w:p>
+    <w:p>
+      <w:r>
+        <w:t xml:space="preserve">  "slug": "salade-quinoa-avocat",</w:t>
+      </w:r>
+    </w:p>
+    <w:p>
+      <w:r>
+        <w:t xml:space="preserve">  "title": "Salade de quinoa &amp; avocat",</w:t>
+      </w:r>
+    </w:p>
+    <w:p>
+      <w:r>
+        <w:t xml:space="preserve">  "images": ["/img/recipes/quinoa1.jpg"],</w:t>
+      </w:r>
+    </w:p>
+    <w:p>
+      <w:pPr>
+        <w:rPr>
+          <w:lang w:val="en-US"/>
+        </w:rPr>
+      </w:pPr>
+      <w:r>
+        <w:t xml:space="preserve">  </w:t>
+      </w:r>
+      <w:r>
+        <w:rPr>
+          <w:lang w:val="en-US"/>
+        </w:rPr>
+        <w:t>"tags": ["vegan", "gluten-free", "low-carb"],</w:t>
+      </w:r>
+    </w:p>
+    <w:p>
+      <w:pPr>
+        <w:rPr>
+          <w:lang w:val="en-US"/>
+        </w:rPr>
+      </w:pPr>
+      <w:r>
+        <w:rPr>
+          <w:lang w:val="en-US"/>
+        </w:rPr>
+        <w:t xml:space="preserve">  "servings": 2,</w:t>
+      </w:r>
+    </w:p>
+    <w:p>
+      <w:pPr>
+        <w:rPr>
+          <w:lang w:val="en-US"/>
+        </w:rPr>
+      </w:pPr>
+      <w:r>
+        <w:rPr>
+          <w:lang w:val="en-US"/>
+        </w:rPr>
+        <w:t xml:space="preserve">  "nutrition": {"kcal": 480, "protein": 18, "fat": 20, "carb": 52},</w:t>
+      </w:r>
+    </w:p>
+    <w:p>
+      <w:pPr>
+        <w:rPr>
+          <w:lang w:val="en-US"/>
+        </w:rPr>
+      </w:pPr>
+      <w:r>
+        <w:rPr>
+          <w:lang w:val="en-US"/>
+        </w:rPr>
+        <w:t xml:space="preserve">  "ingredients": [</w:t>
+      </w:r>
+    </w:p>
+    <w:p>
+      <w:pPr>
+        <w:rPr>
+          <w:lang w:val="en-US"/>
+        </w:rPr>
+      </w:pPr>
+      <w:r>
+        <w:rPr>
+          <w:lang w:val="en-US"/>
+        </w:rPr>
+        <w:t xml:space="preserve">    {"name": "Quinoa", "qty": 120, "unit": "g"},</w:t>
+      </w:r>
+    </w:p>
+    <w:p>
+      <w:pPr>
+        <w:rPr>
+          <w:lang w:val="en-US"/>
+        </w:rPr>
+      </w:pPr>
+      <w:r>
+        <w:rPr>
+          <w:lang w:val="en-US"/>
+        </w:rPr>
+        <w:t xml:space="preserve">    {"name": "Avocat", "qty": 1, "unit": "pc"}</w:t>
+      </w:r>
+    </w:p>
+    <w:p>
+      <w:r>
+        <w:rPr>
+          <w:lang w:val="en-US"/>
+        </w:rPr>
+        <w:t xml:space="preserve">  </w:t>
+      </w:r>
+      <w:r>
+        <w:t>],</w:t>
+      </w:r>
+    </w:p>
+    <w:p>
+      <w:r>
+        <w:t xml:space="preserve">  "steps": ["Rincer le quinoa", "Cuire 12 min", "Assembler"],</w:t>
+      </w:r>
+    </w:p>
+    <w:p>
+      <w:pPr>
+        <w:rPr>
+          <w:lang w:val="en-US"/>
+        </w:rPr>
+      </w:pPr>
+      <w:r>
+        <w:t xml:space="preserve">  </w:t>
+      </w:r>
+      <w:r>
+        <w:rPr>
+          <w:lang w:val="en-US"/>
+        </w:rPr>
+        <w:t>"allergens": ["none"],</w:t>
+      </w:r>
+    </w:p>
+    <w:p>
+      <w:pPr>
+        <w:rPr>
+          <w:lang w:val="en-US"/>
+        </w:rPr>
+      </w:pPr>
+      <w:r>
+        <w:rPr>
+          <w:lang w:val="en-US"/>
+        </w:rPr>
+        <w:t xml:space="preserve">  "authorCoachId": "guid-optional",</w:t>
+      </w:r>
+    </w:p>
+    <w:p>
+      <w:pPr>
+        <w:rPr>
+          <w:lang w:val="en-US"/>
+        </w:rPr>
+      </w:pPr>
+      <w:r>
+        <w:rPr>
+          <w:lang w:val="en-US"/>
+        </w:rPr>
+        <w:t xml:space="preserve">  "createdAt": ISODate,</w:t>
+      </w:r>
+    </w:p>
+    <w:p>
+      <w:pPr>
+        <w:rPr>
+          <w:lang w:val="en-US"/>
+        </w:rPr>
+      </w:pPr>
+      <w:r>
+        <w:rPr>
+          <w:lang w:val="en-US"/>
+        </w:rPr>
+        <w:t xml:space="preserve">  "updatedAt": ISODate</w:t>
+      </w:r>
+    </w:p>
+    <w:p>
+      <w:pPr>
+        <w:rPr>
+          <w:lang w:val="en-US"/>
+        </w:rPr>
+      </w:pPr>
+      <w:r>
+        <w:rPr>
+          <w:lang w:val="en-US"/>
+        </w:rPr>
+        <w:t>}</w:t>
+      </w:r>
+    </w:p>
+    <w:p>
+      <w:pPr>
+        <w:rPr>
+          <w:lang w:val="en-US"/>
+        </w:rPr>
       </w:pPr>
       <w:r>
         <w:rPr>
           <w:b/>
           <w:bCs/>
-        </w:rPr>
-        <w:t>Substituer</w:t>
-      </w:r>
-      <w:r>
-        <w:t xml:space="preserve"> une recette par une autre issue de la base (propose un équivalent nutritionnel / filtrage par contraintes : calories, allergies, préférence).</w:t>
-      </w:r>
-    </w:p>
-    <w:p>
-      <w:pPr>
-        <w:numPr>
-          <w:ilvl w:val="0"/>
-          <w:numId w:val="2"/>
-        </w:numPr>
-      </w:pPr>
-      <w:r>
-        <w:rPr>
-          <w:b/>
-          <w:bCs/>
-        </w:rPr>
-        <w:t>Messagerie</w:t>
-      </w:r>
-      <w:r>
-        <w:t xml:space="preserve"> avec le coach (fil de discussion temps réel).</w:t>
-      </w:r>
-    </w:p>
-    <w:p>
-      <w:pPr>
-        <w:numPr>
-          <w:ilvl w:val="0"/>
-          <w:numId w:val="2"/>
-        </w:numPr>
-      </w:pPr>
-      <w:r>
-        <w:rPr>
-          <w:b/>
-          <w:bCs/>
-        </w:rPr>
-        <w:t>Profil</w:t>
-      </w:r>
-      <w:r>
-        <w:t xml:space="preserve"> (photo, objectifs, allergies, préférences alimentaires, contraintes médicales </w:t>
-      </w:r>
-      <w:r>
-        <w:rPr>
-          <w:i/>
-          <w:iCs/>
-        </w:rPr>
-        <w:t>non diagnostiques</w:t>
-      </w:r>
-      <w:r>
-        <w:t>, fuseau horaire).</w:t>
-      </w:r>
-    </w:p>
-    <w:p>
-      <w:pPr>
-        <w:numPr>
-          <w:ilvl w:val="0"/>
-          <w:numId w:val="2"/>
-        </w:numPr>
-      </w:pPr>
-      <w:r>
-        <w:rPr>
-          <w:b/>
-          <w:bCs/>
-        </w:rPr>
-        <w:t>Progrès</w:t>
-      </w:r>
-      <w:r>
-        <w:t xml:space="preserve"> : saisie/consultation d’entrées historiques (date, poids, mensurations libres, photos, texte libre). Graphiques de progression.</w:t>
-      </w:r>
-    </w:p>
-    <w:p>
-      <w:pPr>
-        <w:rPr>
-          <w:b/>
-          <w:bCs/>
-        </w:rPr>
-      </w:pPr>
-      <w:r>
-        <w:rPr>
-          <w:b/>
-          <w:bCs/>
-        </w:rPr>
-        <w:t>2.2 Coach</w:t>
-      </w:r>
-    </w:p>
-    <w:p>
-      <w:pPr>
-        <w:numPr>
-          <w:ilvl w:val="0"/>
-          <w:numId w:val="3"/>
-        </w:numPr>
-      </w:pPr>
-      <w:r>
-        <w:rPr>
-          <w:b/>
-          <w:bCs/>
-        </w:rPr>
-        <w:t>Créer des comptes utilisateurs</w:t>
-      </w:r>
-      <w:r>
-        <w:t xml:space="preserve"> (onboarding) ou invitation par e</w:t>
-      </w:r>
-      <w:r>
-        <w:noBreakHyphen/>
-        <w:t>mail.</w:t>
-      </w:r>
-    </w:p>
-    <w:p>
-      <w:pPr>
-        <w:numPr>
-          <w:ilvl w:val="0"/>
-          <w:numId w:val="3"/>
-        </w:numPr>
-      </w:pPr>
-      <w:r>
-        <w:rPr>
-          <w:b/>
-          <w:bCs/>
-        </w:rPr>
-        <w:t>Gérer des plannings</w:t>
-      </w:r>
-      <w:r>
-        <w:t xml:space="preserve"> par utilisateur (CRUD de semaines, jours, repas, recettes associées).</w:t>
-      </w:r>
-    </w:p>
-    <w:p>
-      <w:pPr>
-        <w:numPr>
-          <w:ilvl w:val="0"/>
-          <w:numId w:val="3"/>
-        </w:numPr>
-      </w:pPr>
-      <w:r>
-        <w:t xml:space="preserve">Accéder à la </w:t>
-      </w:r>
-      <w:r>
-        <w:rPr>
-          <w:b/>
-          <w:bCs/>
-        </w:rPr>
-        <w:t>liste de ses utilisateurs suivis</w:t>
-      </w:r>
-      <w:r>
-        <w:t xml:space="preserve"> + fiches.</w:t>
-      </w:r>
-    </w:p>
-    <w:p>
-      <w:pPr>
-        <w:numPr>
-          <w:ilvl w:val="0"/>
-          <w:numId w:val="3"/>
-        </w:numPr>
-      </w:pPr>
-      <w:r>
+          <w:lang w:val="en-US"/>
+        </w:rPr>
+        <w:t>messages</w:t>
+      </w:r>
+      <w:r>
+        <w:rPr>
+          <w:lang w:val="en-US"/>
+        </w:rPr>
+        <w:t xml:space="preserve"> (threads de messagerie)</w:t>
+      </w:r>
+    </w:p>
+    <w:p>
+      <w:pPr>
+        <w:rPr>
+          <w:lang w:val="en-US"/>
+        </w:rPr>
+      </w:pPr>
+      <w:r>
+        <w:rPr>
+          <w:lang w:val="en-US"/>
+        </w:rPr>
+        <w:t>{</w:t>
+      </w:r>
+    </w:p>
+    <w:p>
+      <w:pPr>
+        <w:rPr>
+          <w:lang w:val="en-US"/>
+        </w:rPr>
+      </w:pPr>
+      <w:r>
+        <w:rPr>
+          <w:lang w:val="en-US"/>
+        </w:rPr>
+        <w:t xml:space="preserve">  "_id": ObjectId,</w:t>
+      </w:r>
+    </w:p>
+    <w:p>
+      <w:pPr>
+        <w:rPr>
+          <w:lang w:val="en-US"/>
+        </w:rPr>
+      </w:pPr>
+      <w:r>
+        <w:rPr>
+          <w:lang w:val="en-US"/>
+        </w:rPr>
+        <w:t xml:space="preserve">  "threadKey": "coachId:clientId",</w:t>
+      </w:r>
+    </w:p>
+    <w:p>
+      <w:pPr>
+        <w:rPr>
+          <w:lang w:val="en-US"/>
+        </w:rPr>
+      </w:pPr>
+      <w:r>
+        <w:rPr>
+          <w:lang w:val="en-US"/>
+        </w:rPr>
+        <w:t xml:space="preserve">  "participants": ["coachGuid", "clientGuid"],</w:t>
+      </w:r>
+    </w:p>
+    <w:p>
+      <w:pPr>
+        <w:rPr>
+          <w:lang w:val="en-US"/>
+        </w:rPr>
+      </w:pPr>
+      <w:r>
+        <w:rPr>
+          <w:lang w:val="en-US"/>
+        </w:rPr>
+        <w:t xml:space="preserve">  "messages": [</w:t>
+      </w:r>
+    </w:p>
+    <w:p>
+      <w:pPr>
+        <w:rPr>
+          <w:lang w:val="en-US"/>
+        </w:rPr>
+      </w:pPr>
+      <w:r>
+        <w:rPr>
+          <w:lang w:val="en-US"/>
+        </w:rPr>
+        <w:t xml:space="preserve">    {"id":"uuid","sender":"coachGuid","text":"Bonjour !","at": ISODate,</w:t>
+      </w:r>
+    </w:p>
+    <w:p>
+      <w:pPr>
+        <w:rPr>
+          <w:lang w:val="en-US"/>
+        </w:rPr>
+      </w:pPr>
+      <w:r>
+        <w:rPr>
+          <w:lang w:val="en-US"/>
+        </w:rPr>
+        <w:t xml:space="preserve">     "attachments": [{"type":"image","url":"/blob/…"}]}</w:t>
+      </w:r>
+    </w:p>
+    <w:p>
+      <w:pPr>
+        <w:rPr>
+          <w:lang w:val="en-US"/>
+        </w:rPr>
+      </w:pPr>
+      <w:r>
+        <w:rPr>
+          <w:lang w:val="en-US"/>
+        </w:rPr>
+        <w:t xml:space="preserve">  ],</w:t>
+      </w:r>
+    </w:p>
+    <w:p>
+      <w:pPr>
+        <w:rPr>
+          <w:lang w:val="en-US"/>
+        </w:rPr>
+      </w:pPr>
+      <w:r>
+        <w:rPr>
+          <w:lang w:val="en-US"/>
+        </w:rPr>
         <w:lastRenderedPageBreak/>
-        <w:t xml:space="preserve">Accéder/éditer la </w:t>
-      </w:r>
-      <w:r>
-        <w:rPr>
-          <w:b/>
-          <w:bCs/>
-        </w:rPr>
-        <w:t>BDD de recettes « healthy »</w:t>
-      </w:r>
-      <w:r>
-        <w:t xml:space="preserve"> (création, balises, valeurs nutritionnelles, contraintes, images).</w:t>
-      </w:r>
-    </w:p>
-    <w:p>
-      <w:pPr>
-        <w:numPr>
-          <w:ilvl w:val="0"/>
-          <w:numId w:val="3"/>
-        </w:numPr>
-      </w:pPr>
-      <w:r>
-        <w:rPr>
-          <w:b/>
-          <w:bCs/>
-        </w:rPr>
-        <w:t>Modifier sa photo de profil</w:t>
-      </w:r>
-      <w:r>
-        <w:t xml:space="preserve"> et ses infos publiques (bio, spécialités, disponibilité).</w:t>
-      </w:r>
-    </w:p>
-    <w:p>
-      <w:pPr>
-        <w:rPr>
-          <w:b/>
-          <w:bCs/>
-        </w:rPr>
-      </w:pPr>
-      <w:r>
-        <w:rPr>
-          <w:b/>
-          <w:bCs/>
-        </w:rPr>
-        <w:t>2.3 Hors périmètre (MVP)</w:t>
-      </w:r>
-    </w:p>
-    <w:p>
-      <w:pPr>
-        <w:numPr>
-          <w:ilvl w:val="0"/>
-          <w:numId w:val="4"/>
-        </w:numPr>
-      </w:pPr>
-      <w:r>
-        <w:t>Paiements en ligne et facturation.</w:t>
-      </w:r>
-    </w:p>
-    <w:p>
-      <w:pPr>
-        <w:numPr>
-          <w:ilvl w:val="0"/>
-          <w:numId w:val="4"/>
-        </w:numPr>
-      </w:pPr>
-      <w:r>
-        <w:t>Vidéos live / visio (remplaçable par lien externe).</w:t>
-      </w:r>
-    </w:p>
-    <w:p>
-      <w:pPr>
-        <w:numPr>
-          <w:ilvl w:val="0"/>
-          <w:numId w:val="4"/>
-        </w:numPr>
-      </w:pPr>
-      <w:r>
-        <w:t>Algorithme de recommandation avancé.</w:t>
-      </w:r>
-    </w:p>
-    <w:p>
-      <w:r>
-        <w:pict w14:anchorId="2E0372A5">
-          <v:rect id="_x0000_i1026" style="width:0;height:1.5pt" o:hralign="center" o:hrstd="t" o:hr="t" fillcolor="#a0a0a0" stroked="f"/>
-        </w:pict>
-      </w:r>
-    </w:p>
-    <w:p>
-      <w:pPr>
-        <w:rPr>
-          <w:b/>
-          <w:bCs/>
-        </w:rPr>
-      </w:pPr>
-      <w:r>
-        <w:rPr>
-          <w:b/>
-          <w:bCs/>
-        </w:rPr>
-        <w:t>3) Architecture</w:t>
-      </w:r>
-    </w:p>
-    <w:p>
-      <w:r>
-        <w:rPr>
-          <w:b/>
-          <w:bCs/>
-        </w:rPr>
-        <w:t>Front</w:t>
-      </w:r>
-      <w:r>
-        <w:rPr>
-          <w:b/>
-          <w:bCs/>
-        </w:rPr>
-        <w:noBreakHyphen/>
-        <w:t>end :</w:t>
-      </w:r>
-      <w:r>
-        <w:t xml:space="preserve"> Blazor WebAssembly (PWA) + Service Worker (offline light, cache d’actifs, cache de dernières données consultées) + Auth via JWT Bearer.</w:t>
-      </w:r>
-    </w:p>
-    <w:p>
-      <w:r>
-        <w:rPr>
-          <w:b/>
-          <w:bCs/>
-        </w:rPr>
-        <w:t>Back</w:t>
-      </w:r>
-      <w:r>
-        <w:rPr>
-          <w:b/>
-          <w:bCs/>
-        </w:rPr>
-        <w:noBreakHyphen/>
-        <w:t>end :</w:t>
-      </w:r>
-      <w:r>
-        <w:t xml:space="preserve"> ASP.NET Core 9 (API REST), SignalR pour messagerie temps réel, Swagger/NSwag pour OpenAPI, ASP.NET Identity pour gestion comptes/roles.</w:t>
-      </w:r>
-    </w:p>
-    <w:p>
-      <w:r>
-        <w:rPr>
-          <w:b/>
-          <w:bCs/>
-        </w:rPr>
-        <w:t>Data :</w:t>
-      </w:r>
-    </w:p>
-    <w:p>
-      <w:pPr>
-        <w:numPr>
-          <w:ilvl w:val="0"/>
-          <w:numId w:val="5"/>
-        </w:numPr>
-      </w:pPr>
-      <w:r>
-        <w:rPr>
-          <w:b/>
-          <w:bCs/>
-        </w:rPr>
-        <w:t>SQL Server</w:t>
-      </w:r>
-      <w:r>
-        <w:t xml:space="preserve"> (relationnel, données transactionnelles &amp; référentiels) : Utilisateurs, Coachs, relation Coach</w:t>
-      </w:r>
-      <w:r>
-        <w:noBreakHyphen/>
-        <w:t>Utilisateur, Plannings (semaine/jour/repas), assignations de recettes, contraintes/étiquettes, consentements, audit minimal.</w:t>
-      </w:r>
-    </w:p>
-    <w:p>
-      <w:pPr>
-        <w:numPr>
-          <w:ilvl w:val="0"/>
-          <w:numId w:val="5"/>
-        </w:numPr>
-      </w:pPr>
-      <w:r>
-        <w:rPr>
-          <w:b/>
-          <w:bCs/>
-        </w:rPr>
-        <w:t>MongoDB</w:t>
-      </w:r>
-      <w:r>
-        <w:t xml:space="preserve"> (documents) : Recettes (schéma flexible ingrédients/étapes/valeurs), Messagerie (threads/messages), Progrès utilisateurs (entrées journalières/hebdo avec pièces jointes), snapshots de stats.</w:t>
-      </w:r>
-    </w:p>
-    <w:p>
-      <w:r>
-        <w:rPr>
-          <w:b/>
-          <w:bCs/>
-        </w:rPr>
-        <w:t>Stockage fichiers</w:t>
-      </w:r>
-      <w:r>
-        <w:t xml:space="preserve"> : Photos profil, photos de progrès, images recettes → provider abstrait (IFileStorage) : disque local en dev, blob storage en prod.</w:t>
-      </w:r>
-    </w:p>
-    <w:p>
-      <w:r>
-        <w:rPr>
-          <w:b/>
-          <w:bCs/>
-        </w:rPr>
-        <w:t>Infra &amp; déploiement :</w:t>
-      </w:r>
-      <w:r>
-        <w:t xml:space="preserve"> Docker (API + Nginx pour les assets PWA + Mongo + SQL Server dev), environnements Dev/Staging/Prod. Observabilité : Serilog + OpenTelemetry + Prometheus/Grafana (optionnel) + Health Checks.</w:t>
-      </w:r>
-    </w:p>
-    <w:p>
-      <w:r>
-        <w:rPr>
-          <w:b/>
-          <w:bCs/>
-        </w:rPr>
-        <w:t>Schéma haut</w:t>
-      </w:r>
-      <w:r>
-        <w:rPr>
-          <w:b/>
-          <w:bCs/>
-        </w:rPr>
-        <w:noBreakHyphen/>
-        <w:t>niveau (logique)</w:t>
-      </w:r>
-    </w:p>
-    <w:p>
-      <w:r>
-        <w:t>Blazor WASM (PWA)  &lt;—HTTP/SignalR—&gt;  ASP.NET Core API + SignalR Hub</w:t>
-      </w:r>
-    </w:p>
-    <w:p>
-      <w:r>
-        <w:t xml:space="preserve">                                         |\</w:t>
-      </w:r>
-    </w:p>
-    <w:p>
-      <w:r>
-        <w:t xml:space="preserve">                                         | REST CRUD</w:t>
-      </w:r>
-    </w:p>
-    <w:p>
-      <w:r>
-        <w:t xml:space="preserve">                                         v</w:t>
-      </w:r>
-    </w:p>
-    <w:p>
-      <w:r>
-        <w:lastRenderedPageBreak/>
-        <w:t xml:space="preserve">                                    SQL Server  (relationnel)</w:t>
-      </w:r>
-    </w:p>
-    <w:p>
-      <w:r>
-        <w:t xml:space="preserve">                                         \</w:t>
-      </w:r>
-    </w:p>
-    <w:p>
-      <w:r>
-        <w:t xml:space="preserve">                                          \— MongoDB (documents)</w:t>
-      </w:r>
-    </w:p>
-    <w:p>
-      <w:r>
-        <w:pict w14:anchorId="5551DE4F">
-          <v:rect id="_x0000_i1027" style="width:0;height:1.5pt" o:hralign="center" o:hrstd="t" o:hr="t" fillcolor="#a0a0a0" stroked="f"/>
-        </w:pict>
-      </w:r>
-    </w:p>
-    <w:p>
-      <w:pPr>
-        <w:rPr>
-          <w:b/>
-          <w:bCs/>
-        </w:rPr>
-      </w:pPr>
-      <w:r>
-        <w:rPr>
-          <w:b/>
-          <w:bCs/>
-        </w:rPr>
-        <w:t>4) Modèle de données</w:t>
-      </w:r>
-    </w:p>
-    <w:p>
-      <w:pPr>
-        <w:rPr>
-          <w:b/>
-          <w:bCs/>
-        </w:rPr>
-      </w:pPr>
-      <w:r>
-        <w:rPr>
-          <w:b/>
-          <w:bCs/>
-        </w:rPr>
-        <w:t xml:space="preserve">4.1 SQL Server </w:t>
-      </w:r>
-    </w:p>
-    <w:p>
-      <w:r>
-        <w:rPr>
-          <w:b/>
-          <w:bCs/>
-        </w:rPr>
-        <w:t>Users</w:t>
-      </w:r>
-      <w:r>
-        <w:t xml:space="preserve"> (AspNetUsers étendu)</w:t>
-      </w:r>
-    </w:p>
-    <w:p>
-      <w:pPr>
-        <w:numPr>
-          <w:ilvl w:val="0"/>
-          <w:numId w:val="6"/>
-        </w:numPr>
-      </w:pPr>
-      <w:r>
-        <w:t>Id (GUID PK)</w:t>
-      </w:r>
-    </w:p>
-    <w:p>
-      <w:pPr>
-        <w:numPr>
-          <w:ilvl w:val="0"/>
-          <w:numId w:val="6"/>
-        </w:numPr>
-      </w:pPr>
-      <w:r>
-        <w:t>UUID (CHAR(36))</w:t>
-      </w:r>
-    </w:p>
-    <w:p>
-      <w:pPr>
-        <w:numPr>
-          <w:ilvl w:val="0"/>
-          <w:numId w:val="6"/>
-        </w:numPr>
-      </w:pPr>
-      <w:r>
-        <w:t>Email (unique), PasswordHash,</w:t>
-      </w:r>
-    </w:p>
-    <w:p>
-      <w:pPr>
-        <w:numPr>
-          <w:ilvl w:val="0"/>
-          <w:numId w:val="6"/>
-        </w:numPr>
-      </w:pPr>
-      <w:r>
-        <w:t xml:space="preserve">Role (enum/IdentityRole : </w:t>
-      </w:r>
-      <w:r>
-        <w:rPr>
-          <w:b/>
-          <w:bCs/>
-        </w:rPr>
-        <w:t>PARTICULIER</w:t>
-      </w:r>
-      <w:r>
-        <w:t xml:space="preserve">, </w:t>
-      </w:r>
-      <w:r>
-        <w:rPr>
-          <w:b/>
-          <w:bCs/>
-        </w:rPr>
-        <w:t>COACH</w:t>
-      </w:r>
-      <w:r>
-        <w:t xml:space="preserve">, </w:t>
-      </w:r>
-      <w:r>
-        <w:rPr>
-          <w:b/>
-          <w:bCs/>
-        </w:rPr>
-        <w:t>ADMIN</w:t>
-      </w:r>
-      <w:r>
-        <w:t>)</w:t>
-      </w:r>
-    </w:p>
-    <w:p>
-      <w:pPr>
-        <w:numPr>
-          <w:ilvl w:val="0"/>
-          <w:numId w:val="6"/>
-        </w:numPr>
-      </w:pPr>
-      <w:r>
-        <w:t>Firstname,lastname,gender,birthdate</w:t>
-      </w:r>
-    </w:p>
-    <w:p>
-      <w:pPr>
-        <w:numPr>
-          <w:ilvl w:val="0"/>
-          <w:numId w:val="6"/>
-        </w:numPr>
-      </w:pPr>
-      <w:r>
-        <w:t>Size,weight</w:t>
-      </w:r>
-    </w:p>
-    <w:p>
-      <w:pPr>
-        <w:numPr>
-          <w:ilvl w:val="0"/>
-          <w:numId w:val="6"/>
-        </w:numPr>
-      </w:pPr>
-      <w:r>
-        <w:t>Physical_activity,job</w:t>
-      </w:r>
-    </w:p>
-    <w:p>
-      <w:pPr>
-        <w:numPr>
-          <w:ilvl w:val="0"/>
-          <w:numId w:val="6"/>
-        </w:numPr>
-      </w:pPr>
-      <w:r>
-        <w:t>Energy_requirement</w:t>
-      </w:r>
-    </w:p>
-    <w:p>
-      <w:pPr>
-        <w:numPr>
-          <w:ilvl w:val="0"/>
-          <w:numId w:val="6"/>
-        </w:numPr>
-      </w:pPr>
-      <w:r>
-        <w:t>CreatedAt, LastLogin</w:t>
-      </w:r>
-    </w:p>
-    <w:p>
-      <w:pPr>
-        <w:rPr>
-          <w:b/>
-          <w:bCs/>
-        </w:rPr>
-      </w:pPr>
-      <w:r>
-        <w:rPr>
-          <w:b/>
-          <w:bCs/>
-        </w:rPr>
-        <w:t>Rol</w:t>
-      </w:r>
-      <w:r>
-        <w:rPr>
-          <w:b/>
-          <w:bCs/>
-        </w:rPr>
-        <w:t>es</w:t>
-      </w:r>
-    </w:p>
-    <w:p>
-      <w:pPr>
-        <w:pStyle w:val="ListParagraph"/>
-        <w:numPr>
-          <w:ilvl w:val="0"/>
-          <w:numId w:val="33"/>
-        </w:numPr>
-      </w:pPr>
-      <w:r>
-        <w:t>Id(PK)</w:t>
-      </w:r>
-    </w:p>
-    <w:p>
-      <w:pPr>
-        <w:pStyle w:val="ListParagraph"/>
-        <w:numPr>
-          <w:ilvl w:val="0"/>
-          <w:numId w:val="33"/>
-        </w:numPr>
-      </w:pPr>
-      <w:r>
-        <w:t>Name VARCHAR(255)</w:t>
-      </w:r>
-    </w:p>
-    <w:p>
-      <w:r>
-        <w:rPr>
-          <w:b/>
-          <w:bCs/>
-        </w:rPr>
-        <w:t>MealPlan</w:t>
-      </w:r>
-    </w:p>
-    <w:p>
-      <w:pPr>
-        <w:numPr>
-          <w:ilvl w:val="0"/>
-          <w:numId w:val="9"/>
-        </w:numPr>
-        <w:rPr>
-          <w:lang w:val="en-US"/>
-        </w:rPr>
-      </w:pPr>
-      <w:r>
-        <w:rPr>
-          <w:lang w:val="en-US"/>
-        </w:rPr>
-        <w:t>Id, ClientId, CoachId, WeekStart (date ISO), Notes</w:t>
-      </w:r>
-    </w:p>
-    <w:p>
-      <w:r>
-        <w:rPr>
-          <w:b/>
-          <w:bCs/>
-        </w:rPr>
-        <w:t>MealDay</w:t>
-      </w:r>
-    </w:p>
-    <w:p>
-      <w:pPr>
-        <w:numPr>
-          <w:ilvl w:val="0"/>
-          <w:numId w:val="10"/>
-        </w:numPr>
-      </w:pPr>
-      <w:r>
-        <w:t>Id, MealPlanId, Date</w:t>
-      </w:r>
-    </w:p>
-    <w:p>
-      <w:r>
-        <w:rPr>
-          <w:b/>
-          <w:bCs/>
-        </w:rPr>
-        <w:t>MealSlot</w:t>
-      </w:r>
-    </w:p>
-    <w:p>
-      <w:pPr>
-        <w:numPr>
-          <w:ilvl w:val="0"/>
-          <w:numId w:val="11"/>
-        </w:numPr>
-        <w:rPr>
-          <w:lang w:val="en-US"/>
-        </w:rPr>
-      </w:pPr>
-      <w:r>
-        <w:rPr>
-          <w:lang w:val="en-US"/>
-        </w:rPr>
-        <w:t>Id, MealDayId, SlotType (Breakfast|Lunch|Snack|Dinner), RecipeRef (string) → pointeur vers Mongo Recettes, Substitutable (bool), Notes</w:t>
-      </w:r>
-    </w:p>
-    <w:p>
-      <w:r>
-        <w:rPr>
-          <w:b/>
-          <w:bCs/>
-        </w:rPr>
-        <w:t>Consent/Audit</w:t>
-      </w:r>
-      <w:r>
-        <w:t xml:space="preserve"> (optionnel MVP+)</w:t>
-      </w:r>
-    </w:p>
-    <w:p>
-      <w:pPr>
-        <w:numPr>
-          <w:ilvl w:val="0"/>
-          <w:numId w:val="12"/>
-        </w:numPr>
-      </w:pPr>
-      <w:r>
-        <w:t>Id, UserId, Type, GivenAt, RevokedAt</w:t>
-      </w:r>
-    </w:p>
-    <w:p>
-      <w:pPr>
-        <w:rPr>
-          <w:lang w:val="en-US"/>
-        </w:rPr>
-      </w:pPr>
-      <w:r>
-        <w:rPr>
-          <w:b/>
-          <w:bCs/>
-          <w:lang w:val="en-US"/>
-        </w:rPr>
-        <w:lastRenderedPageBreak/>
-        <w:t>Indexation</w:t>
-      </w:r>
-      <w:r>
-        <w:rPr>
-          <w:lang w:val="en-US"/>
-        </w:rPr>
-        <w:t xml:space="preserve"> : Users(Email), CoachClient(CoachId,ClientId unique), MealPlan(ClientId,WeekStart unique), MealSlot(MealDayId,SlotType unique).</w:t>
-      </w:r>
-    </w:p>
-    <w:p>
-      <w:pPr>
-        <w:rPr>
-          <w:b/>
-          <w:bCs/>
-        </w:rPr>
-      </w:pPr>
-      <w:r>
-        <w:rPr>
-          <w:b/>
-          <w:bCs/>
-        </w:rPr>
-        <w:t>4.2 MongoDB (extrait)</w:t>
-      </w:r>
-    </w:p>
-    <w:p>
-      <w:r>
-        <w:rPr>
-          <w:b/>
-          <w:bCs/>
-        </w:rPr>
-        <w:t>recipes</w:t>
-      </w:r>
-    </w:p>
-    <w:p>
-      <w:r>
-        <w:t>{</w:t>
-      </w:r>
-    </w:p>
-    <w:p>
-      <w:r>
-        <w:t xml:space="preserve">  "_id": ObjectId,</w:t>
-      </w:r>
-    </w:p>
-    <w:p>
-      <w:r>
-        <w:t xml:space="preserve">  "slug": "salade-quinoa-avocat",</w:t>
-      </w:r>
-    </w:p>
-    <w:p>
-      <w:r>
-        <w:t xml:space="preserve">  "title": "Salade de quinoa &amp; avocat",</w:t>
-      </w:r>
-    </w:p>
-    <w:p>
-      <w:r>
-        <w:t xml:space="preserve">  "images": ["/img/recipes/quinoa1.jpg"],</w:t>
-      </w:r>
-    </w:p>
-    <w:p>
-      <w:pPr>
-        <w:rPr>
-          <w:lang w:val="en-US"/>
-        </w:rPr>
-      </w:pPr>
-      <w:r>
-        <w:t xml:space="preserve">  </w:t>
-      </w:r>
-      <w:r>
-        <w:rPr>
-          <w:lang w:val="en-US"/>
-        </w:rPr>
-        <w:t>"tags": ["vegan", "gluten-free", "low-carb"],</w:t>
-      </w:r>
-    </w:p>
-    <w:p>
-      <w:pPr>
-        <w:rPr>
-          <w:lang w:val="en-US"/>
-        </w:rPr>
-      </w:pPr>
-      <w:r>
-        <w:rPr>
-          <w:lang w:val="en-US"/>
-        </w:rPr>
-        <w:t xml:space="preserve">  "servings": 2,</w:t>
-      </w:r>
-    </w:p>
-    <w:p>
-      <w:pPr>
-        <w:rPr>
-          <w:lang w:val="en-US"/>
-        </w:rPr>
-      </w:pPr>
-      <w:r>
-        <w:rPr>
-          <w:lang w:val="en-US"/>
-        </w:rPr>
-        <w:t xml:space="preserve">  "nutrition": {"kcal": 480, "protein": 18, "fat": 20, "carb": 52},</w:t>
-      </w:r>
-    </w:p>
-    <w:p>
-      <w:pPr>
-        <w:rPr>
-          <w:lang w:val="en-US"/>
-        </w:rPr>
-      </w:pPr>
-      <w:r>
-        <w:rPr>
-          <w:lang w:val="en-US"/>
-        </w:rPr>
-        <w:t xml:space="preserve">  "ingredients": [</w:t>
-      </w:r>
-    </w:p>
-    <w:p>
-      <w:pPr>
-        <w:rPr>
-          <w:lang w:val="en-US"/>
-        </w:rPr>
-      </w:pPr>
-      <w:r>
-        <w:rPr>
-          <w:lang w:val="en-US"/>
-        </w:rPr>
-        <w:t xml:space="preserve">    {"name": "Quinoa", "qty": 120, "unit": "g"},</w:t>
-      </w:r>
-    </w:p>
-    <w:p>
-      <w:pPr>
-        <w:rPr>
-          <w:lang w:val="en-US"/>
-        </w:rPr>
-      </w:pPr>
-      <w:r>
-        <w:rPr>
-          <w:lang w:val="en-US"/>
-        </w:rPr>
-        <w:t xml:space="preserve">    {"name": "Avocat", "qty": 1, "unit": "pc"}</w:t>
-      </w:r>
-    </w:p>
-    <w:p>
-      <w:r>
-        <w:rPr>
-          <w:lang w:val="en-US"/>
-        </w:rPr>
-        <w:t xml:space="preserve">  </w:t>
-      </w:r>
-      <w:r>
-        <w:t>],</w:t>
-      </w:r>
-    </w:p>
-    <w:p>
-      <w:r>
-        <w:t xml:space="preserve">  "steps": ["Rincer le quinoa", "Cuire 12 min", "Assembler"],</w:t>
-      </w:r>
-    </w:p>
-    <w:p>
-      <w:pPr>
-        <w:rPr>
-          <w:lang w:val="en-US"/>
-        </w:rPr>
-      </w:pPr>
-      <w:r>
-        <w:t xml:space="preserve">  </w:t>
-      </w:r>
-      <w:r>
-        <w:rPr>
-          <w:lang w:val="en-US"/>
-        </w:rPr>
-        <w:t>"allergens": ["none"],</w:t>
-      </w:r>
-    </w:p>
-    <w:p>
-      <w:pPr>
-        <w:rPr>
-          <w:lang w:val="en-US"/>
-        </w:rPr>
-      </w:pPr>
-      <w:r>
-        <w:rPr>
-          <w:lang w:val="en-US"/>
-        </w:rPr>
-        <w:t xml:space="preserve">  "authorCoachId": "guid-optional",</w:t>
-      </w:r>
-    </w:p>
-    <w:p>
-      <w:pPr>
-        <w:rPr>
-          <w:lang w:val="en-US"/>
-        </w:rPr>
-      </w:pPr>
-      <w:r>
-        <w:rPr>
-          <w:lang w:val="en-US"/>
-        </w:rPr>
-        <w:t xml:space="preserve">  "createdAt": ISODate,</w:t>
-      </w:r>
-    </w:p>
-    <w:p>
-      <w:pPr>
-        <w:rPr>
-          <w:lang w:val="en-US"/>
-        </w:rPr>
-      </w:pPr>
-      <w:r>
-        <w:rPr>
-          <w:lang w:val="en-US"/>
-        </w:rPr>
-        <w:t xml:space="preserve">  "updatedAt": ISODate</w:t>
-      </w:r>
-    </w:p>
-    <w:p>
-      <w:pPr>
-        <w:rPr>
-          <w:lang w:val="en-US"/>
-        </w:rPr>
-      </w:pPr>
-      <w:r>
-        <w:rPr>
-          <w:lang w:val="en-US"/>
-        </w:rPr>
-        <w:t>}</w:t>
-      </w:r>
-    </w:p>
-    <w:p>
-      <w:pPr>
-        <w:rPr>
-          <w:lang w:val="en-US"/>
-        </w:rPr>
-      </w:pPr>
-      <w:r>
-        <w:rPr>
-          <w:b/>
-          <w:bCs/>
-          <w:lang w:val="en-US"/>
-        </w:rPr>
-        <w:t>messages</w:t>
-      </w:r>
-      <w:r>
-        <w:rPr>
-          <w:lang w:val="en-US"/>
-        </w:rPr>
-        <w:t xml:space="preserve"> (threads de messagerie)</w:t>
-      </w:r>
-    </w:p>
-    <w:p>
-      <w:pPr>
-        <w:rPr>
-          <w:lang w:val="en-US"/>
-        </w:rPr>
-      </w:pPr>
-      <w:r>
-        <w:rPr>
-          <w:lang w:val="en-US"/>
-        </w:rPr>
-        <w:t>{</w:t>
-      </w:r>
-    </w:p>
-    <w:p>
-      <w:pPr>
-        <w:rPr>
-          <w:lang w:val="en-US"/>
-        </w:rPr>
-      </w:pPr>
-      <w:r>
-        <w:rPr>
-          <w:lang w:val="en-US"/>
-        </w:rPr>
-        <w:t xml:space="preserve">  "_id": ObjectId,</w:t>
-      </w:r>
-    </w:p>
-    <w:p>
-      <w:pPr>
-        <w:rPr>
-          <w:lang w:val="en-US"/>
-        </w:rPr>
-      </w:pPr>
-      <w:r>
-        <w:rPr>
-          <w:lang w:val="en-US"/>
-        </w:rPr>
-        <w:t xml:space="preserve">  "threadKey": "coachId:clientId",</w:t>
-      </w:r>
-    </w:p>
-    <w:p>
-      <w:pPr>
-        <w:rPr>
-          <w:lang w:val="en-US"/>
-        </w:rPr>
-      </w:pPr>
-      <w:r>
-        <w:rPr>
-          <w:lang w:val="en-US"/>
-        </w:rPr>
-        <w:t xml:space="preserve">  "participants": ["coachGuid", "clientGuid"],</w:t>
-      </w:r>
-    </w:p>
-    <w:p>
-      <w:pPr>
-        <w:rPr>
-          <w:lang w:val="en-US"/>
-        </w:rPr>
-      </w:pPr>
-      <w:r>
-        <w:rPr>
-          <w:lang w:val="en-US"/>
-        </w:rPr>
-        <w:t xml:space="preserve">  "messages": [</w:t>
-      </w:r>
-    </w:p>
-    <w:p>
-      <w:pPr>
-        <w:rPr>
-          <w:lang w:val="en-US"/>
-        </w:rPr>
-      </w:pPr>
-      <w:r>
-        <w:rPr>
-          <w:lang w:val="en-US"/>
-        </w:rPr>
-        <w:lastRenderedPageBreak/>
-        <w:t xml:space="preserve">    {"id":"uuid","sender":"coachGuid","text":"Bonjour !","at": ISODate,</w:t>
-      </w:r>
-    </w:p>
-    <w:p>
-      <w:pPr>
-        <w:rPr>
-          <w:lang w:val="en-US"/>
-        </w:rPr>
-      </w:pPr>
-      <w:r>
-        <w:rPr>
-          <w:lang w:val="en-US"/>
-        </w:rPr>
-        <w:t xml:space="preserve">     "attachments": [{"type":"image","url":"/blob/…"}]}</w:t>
-      </w:r>
-    </w:p>
-    <w:p>
-      <w:pPr>
-        <w:rPr>
-          <w:lang w:val="en-US"/>
-        </w:rPr>
-      </w:pPr>
-      <w:r>
-        <w:rPr>
-          <w:lang w:val="en-US"/>
-        </w:rPr>
-        <w:t xml:space="preserve">  ],</w:t>
-      </w:r>
-    </w:p>
-    <w:p>
-      <w:pPr>
-        <w:rPr>
-          <w:lang w:val="en-US"/>
-        </w:rPr>
-      </w:pPr>
-      <w:r>
-        <w:rPr>
-          <w:lang w:val="en-US"/>
-        </w:rPr>
         <w:t xml:space="preserve">  "lastAt": ISODate</w:t>
       </w:r>
     </w:p>
@@ -1729,7 +2564,6 @@
         </w:numPr>
       </w:pPr>
       <w:r>
-        <w:lastRenderedPageBreak/>
         <w:t>POST /api/auth/login</w:t>
       </w:r>
     </w:p>
@@ -1767,6 +2601,7 @@
         <w:rPr>
           <w:lang w:val="en-US"/>
         </w:rPr>
+        <w:lastRenderedPageBreak/>
         <w:t xml:space="preserve">GET /api/coach/clients </w:t>
       </w:r>
       <w:r>
@@ -2118,7 +2953,6 @@
         <w:rPr>
           <w:lang w:val="en-US"/>
         </w:rPr>
-        <w:lastRenderedPageBreak/>
         <w:t xml:space="preserve">                               Dictionary&lt;string,double&gt;? Measurements,</w:t>
       </w:r>
     </w:p>
@@ -2156,6 +2990,7 @@
         </w:numPr>
       </w:pPr>
       <w:r>
+        <w:lastRenderedPageBreak/>
         <w:t>FluentValidation ou DataAnnotations.</w:t>
       </w:r>
     </w:p>
@@ -2457,7 +3292,6 @@
         </w:numPr>
       </w:pPr>
       <w:r>
-        <w:lastRenderedPageBreak/>
         <w:t>Service Worker : precache (assets), cache</w:t>
       </w:r>
       <w:r>
@@ -2497,6 +3331,7 @@
         </w:numPr>
       </w:pPr>
       <w:r>
+        <w:lastRenderedPageBreak/>
         <w:t>Composants conformes WCAG 2.1 AA, focus visible, ARIA pour modales et chat.</w:t>
       </w:r>
     </w:p>
@@ -2862,7 +3697,6 @@
         </w:numPr>
       </w:pPr>
       <w:r>
-        <w:lastRenderedPageBreak/>
         <w:t>api (ASP.NET Core)</w:t>
       </w:r>
     </w:p>
@@ -2914,6 +3748,7 @@
         </w:numPr>
       </w:pPr>
       <w:r>
+        <w:lastRenderedPageBreak/>
         <w:t>Build + tests</w:t>
       </w:r>
     </w:p>
@@ -3247,7 +4082,6 @@
         </w:numPr>
       </w:pPr>
       <w:r>
-        <w:lastRenderedPageBreak/>
         <w:t>RGPD (export/suppression) automatisés</w:t>
       </w:r>
     </w:p>
@@ -3290,6 +4124,7 @@
           <w:b/>
           <w:bCs/>
         </w:rPr>
+        <w:lastRenderedPageBreak/>
         <w:t>EF Core (SQL) — MealPlan &amp; slots</w:t>
       </w:r>
     </w:p>
@@ -3582,30 +4417,30 @@
         <w:rPr>
           <w:lang w:val="en-US"/>
         </w:rPr>
+        <w:t xml:space="preserve">  public async Task SendMessage(string threadKey, string text) =&gt;</w:t>
+      </w:r>
+    </w:p>
+    <w:p>
+      <w:pPr>
+        <w:rPr>
+          <w:lang w:val="en-US"/>
+        </w:rPr>
+      </w:pPr>
+      <w:r>
+        <w:rPr>
+          <w:lang w:val="en-US"/>
+        </w:rPr>
+        <w:t xml:space="preserve">    await Clients.Group(threadKey).SendAsync("message", new { text, at = DateTime.UtcNow });</w:t>
+      </w:r>
+    </w:p>
+    <w:p>
+      <w:r>
+        <w:t>}</w:t>
+      </w:r>
+    </w:p>
+    <w:p>
+      <w:r>
         <w:lastRenderedPageBreak/>
-        <w:t xml:space="preserve">  public async Task SendMessage(string threadKey, string text) =&gt;</w:t>
-      </w:r>
-    </w:p>
-    <w:p>
-      <w:pPr>
-        <w:rPr>
-          <w:lang w:val="en-US"/>
-        </w:rPr>
-      </w:pPr>
-      <w:r>
-        <w:rPr>
-          <w:lang w:val="en-US"/>
-        </w:rPr>
-        <w:t xml:space="preserve">    await Clients.Group(threadKey).SendAsync("message", new { text, at = DateTime.UtcNow });</w:t>
-      </w:r>
-    </w:p>
-    <w:p>
-      <w:r>
-        <w:t>}</w:t>
-      </w:r>
-    </w:p>
-    <w:p>
-      <w:r>
         <w:pict w14:anchorId="05AE132A">
           <v:rect id="_x0000_i1037" style="width:0;height:1.5pt" o:hralign="center" o:hrstd="t" o:hr="t" fillcolor="#a0a0a0" stroked="f"/>
         </w:pict>
@@ -3854,9 +4689,9 @@
       <w:lvlJc w:val="left"/>
       <w:pPr>
         <w:tabs>
-          <w:tab w:val="num" w:pos="720"/>
-        </w:tabs>
-        <w:ind w:left="720" w:hanging="360"/>
+          <w:tab w:val="num" w:pos="1068"/>
+        </w:tabs>
+        <w:ind w:left="1068" w:hanging="360"/>
       </w:pPr>
       <w:rPr>
         <w:rFonts w:ascii="Symbol" w:hAnsi="Symbol" w:hint="default"/>
@@ -3870,9 +4705,9 @@
       <w:lvlJc w:val="left"/>
       <w:pPr>
         <w:tabs>
-          <w:tab w:val="num" w:pos="1440"/>
-        </w:tabs>
-        <w:ind w:left="1440" w:hanging="360"/>
+          <w:tab w:val="num" w:pos="1788"/>
+        </w:tabs>
+        <w:ind w:left="1788" w:hanging="360"/>
       </w:pPr>
       <w:rPr>
         <w:rFonts w:ascii="Courier New" w:hAnsi="Courier New" w:hint="default"/>
@@ -3886,9 +4721,9 @@
       <w:lvlJc w:val="left"/>
       <w:pPr>
         <w:tabs>
-          <w:tab w:val="num" w:pos="2160"/>
-        </w:tabs>
-        <w:ind w:left="2160" w:hanging="360"/>
+          <w:tab w:val="num" w:pos="2508"/>
+        </w:tabs>
+        <w:ind w:left="2508" w:hanging="360"/>
       </w:pPr>
       <w:rPr>
         <w:rFonts w:ascii="Wingdings" w:hAnsi="Wingdings" w:hint="default"/>
@@ -3902,9 +4737,9 @@
       <w:lvlJc w:val="left"/>
       <w:pPr>
         <w:tabs>
-          <w:tab w:val="num" w:pos="2880"/>
-        </w:tabs>
-        <w:ind w:left="2880" w:hanging="360"/>
+          <w:tab w:val="num" w:pos="3228"/>
+        </w:tabs>
+        <w:ind w:left="3228" w:hanging="360"/>
       </w:pPr>
       <w:rPr>
         <w:rFonts w:ascii="Wingdings" w:hAnsi="Wingdings" w:hint="default"/>
@@ -3918,9 +4753,9 @@
       <w:lvlJc w:val="left"/>
       <w:pPr>
         <w:tabs>
-          <w:tab w:val="num" w:pos="3600"/>
-        </w:tabs>
-        <w:ind w:left="3600" w:hanging="360"/>
+          <w:tab w:val="num" w:pos="3948"/>
+        </w:tabs>
+        <w:ind w:left="3948" w:hanging="360"/>
       </w:pPr>
       <w:rPr>
         <w:rFonts w:ascii="Wingdings" w:hAnsi="Wingdings" w:hint="default"/>
@@ -3934,9 +4769,9 @@
       <w:lvlJc w:val="left"/>
       <w:pPr>
         <w:tabs>
-          <w:tab w:val="num" w:pos="4320"/>
-        </w:tabs>
-        <w:ind w:left="4320" w:hanging="360"/>
+          <w:tab w:val="num" w:pos="4668"/>
+        </w:tabs>
+        <w:ind w:left="4668" w:hanging="360"/>
       </w:pPr>
       <w:rPr>
         <w:rFonts w:ascii="Wingdings" w:hAnsi="Wingdings" w:hint="default"/>
@@ -3950,9 +4785,9 @@
       <w:lvlJc w:val="left"/>
       <w:pPr>
         <w:tabs>
-          <w:tab w:val="num" w:pos="5040"/>
-        </w:tabs>
-        <w:ind w:left="5040" w:hanging="360"/>
+          <w:tab w:val="num" w:pos="5388"/>
+        </w:tabs>
+        <w:ind w:left="5388" w:hanging="360"/>
       </w:pPr>
       <w:rPr>
         <w:rFonts w:ascii="Wingdings" w:hAnsi="Wingdings" w:hint="default"/>
@@ -3966,9 +4801,9 @@
       <w:lvlJc w:val="left"/>
       <w:pPr>
         <w:tabs>
-          <w:tab w:val="num" w:pos="5760"/>
-        </w:tabs>
-        <w:ind w:left="5760" w:hanging="360"/>
+          <w:tab w:val="num" w:pos="6108"/>
+        </w:tabs>
+        <w:ind w:left="6108" w:hanging="360"/>
       </w:pPr>
       <w:rPr>
         <w:rFonts w:ascii="Wingdings" w:hAnsi="Wingdings" w:hint="default"/>
@@ -3982,9 +4817,9 @@
       <w:lvlJc w:val="left"/>
       <w:pPr>
         <w:tabs>
-          <w:tab w:val="num" w:pos="6480"/>
-        </w:tabs>
-        <w:ind w:left="6480" w:hanging="360"/>
+          <w:tab w:val="num" w:pos="6828"/>
+        </w:tabs>
+        <w:ind w:left="6828" w:hanging="360"/>
       </w:pPr>
       <w:rPr>
         <w:rFonts w:ascii="Wingdings" w:hAnsi="Wingdings" w:hint="default"/>
@@ -5411,6 +6246,118 @@
     </w:lvl>
   </w:abstractNum>
   <w:abstractNum w:abstractNumId="11" w15:restartNumberingAfterBreak="0">
+    <w:nsid w:val="25DE5F27"/>
+    <w:multiLevelType w:val="hybridMultilevel"/>
+    <w:tmpl w:val="0A000936"/>
+    <w:lvl w:ilvl="0" w:tplc="D0DC14BE">
+      <w:numFmt w:val="bullet"/>
+      <w:lvlText w:val="-"/>
+      <w:lvlJc w:val="left"/>
+      <w:pPr>
+        <w:ind w:left="405" w:hanging="360"/>
+      </w:pPr>
+      <w:rPr>
+        <w:rFonts w:ascii="Aptos" w:eastAsiaTheme="minorHAnsi" w:hAnsi="Aptos" w:cstheme="minorBidi" w:hint="default"/>
+      </w:rPr>
+    </w:lvl>
+    <w:lvl w:ilvl="1" w:tplc="040C0003">
+      <w:start w:val="1"/>
+      <w:numFmt w:val="bullet"/>
+      <w:lvlText w:val="o"/>
+      <w:lvlJc w:val="left"/>
+      <w:pPr>
+        <w:ind w:left="1125" w:hanging="360"/>
+      </w:pPr>
+      <w:rPr>
+        <w:rFonts w:ascii="Courier New" w:hAnsi="Courier New" w:cs="Courier New" w:hint="default"/>
+      </w:rPr>
+    </w:lvl>
+    <w:lvl w:ilvl="2" w:tplc="040C0005" w:tentative="1">
+      <w:start w:val="1"/>
+      <w:numFmt w:val="bullet"/>
+      <w:lvlText w:val=""/>
+      <w:lvlJc w:val="left"/>
+      <w:pPr>
+        <w:ind w:left="1845" w:hanging="360"/>
+      </w:pPr>
+      <w:rPr>
+        <w:rFonts w:ascii="Wingdings" w:hAnsi="Wingdings" w:hint="default"/>
+      </w:rPr>
+    </w:lvl>
+    <w:lvl w:ilvl="3" w:tplc="040C0001" w:tentative="1">
+      <w:start w:val="1"/>
+      <w:numFmt w:val="bullet"/>
+      <w:lvlText w:val=""/>
+      <w:lvlJc w:val="left"/>
+      <w:pPr>
+        <w:ind w:left="2565" w:hanging="360"/>
+      </w:pPr>
+      <w:rPr>
+        <w:rFonts w:ascii="Symbol" w:hAnsi="Symbol" w:hint="default"/>
+      </w:rPr>
+    </w:lvl>
+    <w:lvl w:ilvl="4" w:tplc="040C0003" w:tentative="1">
+      <w:start w:val="1"/>
+      <w:numFmt w:val="bullet"/>
+      <w:lvlText w:val="o"/>
+      <w:lvlJc w:val="left"/>
+      <w:pPr>
+        <w:ind w:left="3285" w:hanging="360"/>
+      </w:pPr>
+      <w:rPr>
+        <w:rFonts w:ascii="Courier New" w:hAnsi="Courier New" w:cs="Courier New" w:hint="default"/>
+      </w:rPr>
+    </w:lvl>
+    <w:lvl w:ilvl="5" w:tplc="040C0005" w:tentative="1">
+      <w:start w:val="1"/>
+      <w:numFmt w:val="bullet"/>
+      <w:lvlText w:val=""/>
+      <w:lvlJc w:val="left"/>
+      <w:pPr>
+        <w:ind w:left="4005" w:hanging="360"/>
+      </w:pPr>
+      <w:rPr>
+        <w:rFonts w:ascii="Wingdings" w:hAnsi="Wingdings" w:hint="default"/>
+      </w:rPr>
+    </w:lvl>
+    <w:lvl w:ilvl="6" w:tplc="040C0001" w:tentative="1">
+      <w:start w:val="1"/>
+      <w:numFmt w:val="bullet"/>
+      <w:lvlText w:val=""/>
+      <w:lvlJc w:val="left"/>
+      <w:pPr>
+        <w:ind w:left="4725" w:hanging="360"/>
+      </w:pPr>
+      <w:rPr>
+        <w:rFonts w:ascii="Symbol" w:hAnsi="Symbol" w:hint="default"/>
+      </w:rPr>
+    </w:lvl>
+    <w:lvl w:ilvl="7" w:tplc="040C0003" w:tentative="1">
+      <w:start w:val="1"/>
+      <w:numFmt w:val="bullet"/>
+      <w:lvlText w:val="o"/>
+      <w:lvlJc w:val="left"/>
+      <w:pPr>
+        <w:ind w:left="5445" w:hanging="360"/>
+      </w:pPr>
+      <w:rPr>
+        <w:rFonts w:ascii="Courier New" w:hAnsi="Courier New" w:cs="Courier New" w:hint="default"/>
+      </w:rPr>
+    </w:lvl>
+    <w:lvl w:ilvl="8" w:tplc="040C0005" w:tentative="1">
+      <w:start w:val="1"/>
+      <w:numFmt w:val="bullet"/>
+      <w:lvlText w:val=""/>
+      <w:lvlJc w:val="left"/>
+      <w:pPr>
+        <w:ind w:left="6165" w:hanging="360"/>
+      </w:pPr>
+      <w:rPr>
+        <w:rFonts w:ascii="Wingdings" w:hAnsi="Wingdings" w:hint="default"/>
+      </w:rPr>
+    </w:lvl>
+  </w:abstractNum>
+  <w:abstractNum w:abstractNumId="12" w15:restartNumberingAfterBreak="0">
     <w:nsid w:val="275102BC"/>
     <w:multiLevelType w:val="multilevel"/>
     <w:tmpl w:val="12407BF4"/>
@@ -5559,7 +6506,7 @@
       </w:rPr>
     </w:lvl>
   </w:abstractNum>
-  <w:abstractNum w:abstractNumId="12" w15:restartNumberingAfterBreak="0">
+  <w:abstractNum w:abstractNumId="13" w15:restartNumberingAfterBreak="0">
     <w:nsid w:val="2D833729"/>
     <w:multiLevelType w:val="multilevel"/>
     <w:tmpl w:val="AB3234EA"/>
@@ -5708,7 +6655,7 @@
       </w:rPr>
     </w:lvl>
   </w:abstractNum>
-  <w:abstractNum w:abstractNumId="13" w15:restartNumberingAfterBreak="0">
+  <w:abstractNum w:abstractNumId="14" w15:restartNumberingAfterBreak="0">
     <w:nsid w:val="31A37D9A"/>
     <w:multiLevelType w:val="multilevel"/>
     <w:tmpl w:val="B330C770"/>
@@ -5857,7 +6804,7 @@
       </w:rPr>
     </w:lvl>
   </w:abstractNum>
-  <w:abstractNum w:abstractNumId="14" w15:restartNumberingAfterBreak="0">
+  <w:abstractNum w:abstractNumId="15" w15:restartNumberingAfterBreak="0">
     <w:nsid w:val="37BE25CF"/>
     <w:multiLevelType w:val="multilevel"/>
     <w:tmpl w:val="3E5A945A"/>
@@ -6006,7 +6953,7 @@
       </w:rPr>
     </w:lvl>
   </w:abstractNum>
-  <w:abstractNum w:abstractNumId="15" w15:restartNumberingAfterBreak="0">
+  <w:abstractNum w:abstractNumId="16" w15:restartNumberingAfterBreak="0">
     <w:nsid w:val="3F5E336D"/>
     <w:multiLevelType w:val="multilevel"/>
     <w:tmpl w:val="4F422148"/>
@@ -6155,7 +7102,7 @@
       </w:rPr>
     </w:lvl>
   </w:abstractNum>
-  <w:abstractNum w:abstractNumId="16" w15:restartNumberingAfterBreak="0">
+  <w:abstractNum w:abstractNumId="17" w15:restartNumberingAfterBreak="0">
     <w:nsid w:val="3FC9552C"/>
     <w:multiLevelType w:val="multilevel"/>
     <w:tmpl w:val="6EE818A0"/>
@@ -6304,7 +7251,7 @@
       </w:rPr>
     </w:lvl>
   </w:abstractNum>
-  <w:abstractNum w:abstractNumId="17" w15:restartNumberingAfterBreak="0">
+  <w:abstractNum w:abstractNumId="18" w15:restartNumberingAfterBreak="0">
     <w:nsid w:val="3FE45C56"/>
     <w:multiLevelType w:val="multilevel"/>
     <w:tmpl w:val="0E926860"/>
@@ -6453,7 +7400,7 @@
       </w:rPr>
     </w:lvl>
   </w:abstractNum>
-  <w:abstractNum w:abstractNumId="18" w15:restartNumberingAfterBreak="0">
+  <w:abstractNum w:abstractNumId="19" w15:restartNumberingAfterBreak="0">
     <w:nsid w:val="42F15538"/>
     <w:multiLevelType w:val="multilevel"/>
     <w:tmpl w:val="0FCC668E"/>
@@ -6602,7 +7549,7 @@
       </w:rPr>
     </w:lvl>
   </w:abstractNum>
-  <w:abstractNum w:abstractNumId="19" w15:restartNumberingAfterBreak="0">
+  <w:abstractNum w:abstractNumId="20" w15:restartNumberingAfterBreak="0">
     <w:nsid w:val="468117B6"/>
     <w:multiLevelType w:val="multilevel"/>
     <w:tmpl w:val="A67A0F68"/>
@@ -6751,7 +7698,7 @@
       </w:rPr>
     </w:lvl>
   </w:abstractNum>
-  <w:abstractNum w:abstractNumId="20" w15:restartNumberingAfterBreak="0">
+  <w:abstractNum w:abstractNumId="21" w15:restartNumberingAfterBreak="0">
     <w:nsid w:val="468812DA"/>
     <w:multiLevelType w:val="multilevel"/>
     <w:tmpl w:val="F17E279E"/>
@@ -6900,7 +7847,7 @@
       </w:rPr>
     </w:lvl>
   </w:abstractNum>
-  <w:abstractNum w:abstractNumId="21" w15:restartNumberingAfterBreak="0">
+  <w:abstractNum w:abstractNumId="22" w15:restartNumberingAfterBreak="0">
     <w:nsid w:val="4AD760BF"/>
     <w:multiLevelType w:val="multilevel"/>
     <w:tmpl w:val="B8F87C0E"/>
@@ -7049,7 +7996,7 @@
       </w:rPr>
     </w:lvl>
   </w:abstractNum>
-  <w:abstractNum w:abstractNumId="22" w15:restartNumberingAfterBreak="0">
+  <w:abstractNum w:abstractNumId="23" w15:restartNumberingAfterBreak="0">
     <w:nsid w:val="51877AA3"/>
     <w:multiLevelType w:val="multilevel"/>
     <w:tmpl w:val="29502FD2"/>
@@ -7198,7 +8145,7 @@
       </w:rPr>
     </w:lvl>
   </w:abstractNum>
-  <w:abstractNum w:abstractNumId="23" w15:restartNumberingAfterBreak="0">
+  <w:abstractNum w:abstractNumId="24" w15:restartNumberingAfterBreak="0">
     <w:nsid w:val="56EF6271"/>
     <w:multiLevelType w:val="multilevel"/>
     <w:tmpl w:val="C82E03B2"/>
@@ -7311,7 +8258,7 @@
       </w:pPr>
     </w:lvl>
   </w:abstractNum>
-  <w:abstractNum w:abstractNumId="24" w15:restartNumberingAfterBreak="0">
+  <w:abstractNum w:abstractNumId="25" w15:restartNumberingAfterBreak="0">
     <w:nsid w:val="57163A8D"/>
     <w:multiLevelType w:val="multilevel"/>
     <w:tmpl w:val="E64447C0"/>
@@ -7460,7 +8407,7 @@
       </w:rPr>
     </w:lvl>
   </w:abstractNum>
-  <w:abstractNum w:abstractNumId="25" w15:restartNumberingAfterBreak="0">
+  <w:abstractNum w:abstractNumId="26" w15:restartNumberingAfterBreak="0">
     <w:nsid w:val="57300B60"/>
     <w:multiLevelType w:val="multilevel"/>
     <w:tmpl w:val="140A1AB4"/>
@@ -7609,7 +8556,7 @@
       </w:rPr>
     </w:lvl>
   </w:abstractNum>
-  <w:abstractNum w:abstractNumId="26" w15:restartNumberingAfterBreak="0">
+  <w:abstractNum w:abstractNumId="27" w15:restartNumberingAfterBreak="0">
     <w:nsid w:val="58864284"/>
     <w:multiLevelType w:val="multilevel"/>
     <w:tmpl w:val="0EC865D0"/>
@@ -7758,7 +8705,7 @@
       </w:rPr>
     </w:lvl>
   </w:abstractNum>
-  <w:abstractNum w:abstractNumId="27" w15:restartNumberingAfterBreak="0">
+  <w:abstractNum w:abstractNumId="28" w15:restartNumberingAfterBreak="0">
     <w:nsid w:val="68D56F16"/>
     <w:multiLevelType w:val="multilevel"/>
     <w:tmpl w:val="FE907448"/>
@@ -7907,7 +8854,7 @@
       </w:rPr>
     </w:lvl>
   </w:abstractNum>
-  <w:abstractNum w:abstractNumId="28" w15:restartNumberingAfterBreak="0">
+  <w:abstractNum w:abstractNumId="29" w15:restartNumberingAfterBreak="0">
     <w:nsid w:val="6DCA2D0E"/>
     <w:multiLevelType w:val="multilevel"/>
     <w:tmpl w:val="717E5E46"/>
@@ -8056,7 +9003,7 @@
       </w:rPr>
     </w:lvl>
   </w:abstractNum>
-  <w:abstractNum w:abstractNumId="29" w15:restartNumberingAfterBreak="0">
+  <w:abstractNum w:abstractNumId="30" w15:restartNumberingAfterBreak="0">
     <w:nsid w:val="708A1F18"/>
     <w:multiLevelType w:val="multilevel"/>
     <w:tmpl w:val="17160E7E"/>
@@ -8205,7 +9152,7 @@
       </w:rPr>
     </w:lvl>
   </w:abstractNum>
-  <w:abstractNum w:abstractNumId="30" w15:restartNumberingAfterBreak="0">
+  <w:abstractNum w:abstractNumId="31" w15:restartNumberingAfterBreak="0">
     <w:nsid w:val="77B94EC8"/>
     <w:multiLevelType w:val="multilevel"/>
     <w:tmpl w:val="144888BE"/>
@@ -8354,7 +9301,7 @@
       </w:rPr>
     </w:lvl>
   </w:abstractNum>
-  <w:abstractNum w:abstractNumId="31" w15:restartNumberingAfterBreak="0">
+  <w:abstractNum w:abstractNumId="32" w15:restartNumberingAfterBreak="0">
     <w:nsid w:val="78B507F6"/>
     <w:multiLevelType w:val="multilevel"/>
     <w:tmpl w:val="1B226560"/>
@@ -8503,7 +9450,7 @@
       </w:rPr>
     </w:lvl>
   </w:abstractNum>
-  <w:abstractNum w:abstractNumId="32" w15:restartNumberingAfterBreak="0">
+  <w:abstractNum w:abstractNumId="33" w15:restartNumberingAfterBreak="0">
     <w:nsid w:val="7D4A47E3"/>
     <w:multiLevelType w:val="multilevel"/>
     <w:tmpl w:val="1D8A8854"/>
@@ -8662,16 +9609,16 @@
     <w:abstractNumId w:val="7"/>
   </w:num>
   <w:num w:numId="4" w16cid:durableId="1668635670">
-    <w:abstractNumId w:val="18"/>
+    <w:abstractNumId w:val="19"/>
   </w:num>
   <w:num w:numId="5" w16cid:durableId="969474149">
-    <w:abstractNumId w:val="29"/>
+    <w:abstractNumId w:val="30"/>
   </w:num>
   <w:num w:numId="6" w16cid:durableId="798835731">
-    <w:abstractNumId w:val="20"/>
+    <w:abstractNumId w:val="21"/>
   </w:num>
   <w:num w:numId="7" w16cid:durableId="6564917">
-    <w:abstractNumId w:val="24"/>
+    <w:abstractNumId w:val="25"/>
   </w:num>
   <w:num w:numId="8" w16cid:durableId="1721661161">
     <w:abstractNumId w:val="9"/>
@@ -8680,76 +9627,79 @@
     <w:abstractNumId w:val="4"/>
   </w:num>
   <w:num w:numId="10" w16cid:durableId="1964995635">
-    <w:abstractNumId w:val="14"/>
+    <w:abstractNumId w:val="15"/>
   </w:num>
   <w:num w:numId="11" w16cid:durableId="1466700955">
     <w:abstractNumId w:val="6"/>
   </w:num>
   <w:num w:numId="12" w16cid:durableId="812211413">
-    <w:abstractNumId w:val="12"/>
+    <w:abstractNumId w:val="13"/>
   </w:num>
   <w:num w:numId="13" w16cid:durableId="152915685">
     <w:abstractNumId w:val="8"/>
   </w:num>
   <w:num w:numId="14" w16cid:durableId="1111164659">
-    <w:abstractNumId w:val="32"/>
+    <w:abstractNumId w:val="33"/>
   </w:num>
   <w:num w:numId="15" w16cid:durableId="931428775">
-    <w:abstractNumId w:val="19"/>
+    <w:abstractNumId w:val="20"/>
   </w:num>
   <w:num w:numId="16" w16cid:durableId="101342191">
-    <w:abstractNumId w:val="15"/>
+    <w:abstractNumId w:val="16"/>
   </w:num>
   <w:num w:numId="17" w16cid:durableId="1925795876">
-    <w:abstractNumId w:val="11"/>
+    <w:abstractNumId w:val="12"/>
   </w:num>
   <w:num w:numId="18" w16cid:durableId="1406608964">
-    <w:abstractNumId w:val="13"/>
+    <w:abstractNumId w:val="14"/>
   </w:num>
   <w:num w:numId="19" w16cid:durableId="433206375">
-    <w:abstractNumId w:val="16"/>
+    <w:abstractNumId w:val="17"/>
   </w:num>
   <w:num w:numId="20" w16cid:durableId="1324698100">
     <w:abstractNumId w:val="2"/>
   </w:num>
   <w:num w:numId="21" w16cid:durableId="2122652272">
-    <w:abstractNumId w:val="22"/>
+    <w:abstractNumId w:val="23"/>
   </w:num>
   <w:num w:numId="22" w16cid:durableId="923150988">
-    <w:abstractNumId w:val="30"/>
+    <w:abstractNumId w:val="31"/>
   </w:num>
   <w:num w:numId="23" w16cid:durableId="1173377765">
-    <w:abstractNumId w:val="31"/>
+    <w:abstractNumId w:val="32"/>
   </w:num>
   <w:num w:numId="24" w16cid:durableId="520246420">
+    <w:abstractNumId w:val="29"/>
+  </w:num>
+  <w:num w:numId="25" w16cid:durableId="1172641187">
     <w:abstractNumId w:val="28"/>
   </w:num>
-  <w:num w:numId="25" w16cid:durableId="1172641187">
-    <w:abstractNumId w:val="27"/>
-  </w:num>
   <w:num w:numId="26" w16cid:durableId="1220241044">
-    <w:abstractNumId w:val="21"/>
+    <w:abstractNumId w:val="22"/>
   </w:num>
   <w:num w:numId="27" w16cid:durableId="791703547">
     <w:abstractNumId w:val="3"/>
   </w:num>
   <w:num w:numId="28" w16cid:durableId="1179078356">
-    <w:abstractNumId w:val="17"/>
+    <w:abstractNumId w:val="18"/>
   </w:num>
   <w:num w:numId="29" w16cid:durableId="268853007">
-    <w:abstractNumId w:val="23"/>
+    <w:abstractNumId w:val="24"/>
   </w:num>
   <w:num w:numId="30" w16cid:durableId="1413894935">
     <w:abstractNumId w:val="5"/>
   </w:num>
   <w:num w:numId="31" w16cid:durableId="860626717">
-    <w:abstractNumId w:val="26"/>
+    <w:abstractNumId w:val="27"/>
   </w:num>
   <w:num w:numId="32" w16cid:durableId="1731004573">
-    <w:abstractNumId w:val="25"/>
+    <w:abstractNumId w:val="26"/>
   </w:num>
   <w:num w:numId="33" w16cid:durableId="1997344629">
     <w:abstractNumId w:val="10"/>
+  </w:num>
+  <w:num w:numId="34" w16cid:durableId="1430586126">
+    <w:abstractNumId w:val="11"/>
   </w:num>
 </w:numbering>
 </file>
@@ -9155,37 +10105,39 @@
     <w:name w:val="Normal"/>
     <w:qFormat/>
   </w:style>
-  <w:style w:type="paragraph" w:styleId="Heading1">
+  <w:style w:type="paragraph" w:styleId="Titre1">
     <w:name w:val="heading 1"/>
     <w:basedOn w:val="Normal"/>
     <w:next w:val="Normal"/>
-    <w:link w:val="Heading1Char"/>
+    <w:link w:val="Titre1Car"/>
     <w:uiPriority w:val="9"/>
     <w:qFormat/>
-    <w:rsid w:val="00E960A9"/>
+    <w:rsid w:val="00720538"/>
     <w:pPr>
       <w:keepNext/>
       <w:keepLines/>
       <w:spacing w:before="360" w:after="80"/>
+      <w:jc w:val="center"/>
       <w:outlineLvl w:val="0"/>
     </w:pPr>
     <w:rPr>
-      <w:rFonts w:asciiTheme="majorHAnsi" w:eastAsiaTheme="majorEastAsia" w:hAnsiTheme="majorHAnsi" w:cstheme="majorBidi"/>
-      <w:color w:val="0F4761" w:themeColor="accent1" w:themeShade="BF"/>
-      <w:sz w:val="40"/>
-      <w:szCs w:val="40"/>
+      <w:rFonts w:eastAsiaTheme="majorEastAsia" w:cstheme="majorBidi"/>
+      <w:b/>
+      <w:bCs/>
+      <w:color w:val="275317" w:themeColor="accent6" w:themeShade="80"/>
+      <w:sz w:val="56"/>
+      <w:szCs w:val="56"/>
     </w:rPr>
   </w:style>
-  <w:style w:type="paragraph" w:styleId="Heading2">
+  <w:style w:type="paragraph" w:styleId="Titre2">
     <w:name w:val="heading 2"/>
     <w:basedOn w:val="Normal"/>
     <w:next w:val="Normal"/>
-    <w:link w:val="Heading2Char"/>
+    <w:link w:val="Titre2Car"/>
     <w:uiPriority w:val="9"/>
-    <w:semiHidden/>
     <w:unhideWhenUsed/>
     <w:qFormat/>
-    <w:rsid w:val="00E960A9"/>
+    <w:rsid w:val="00C90859"/>
     <w:pPr>
       <w:keepNext/>
       <w:keepLines/>
@@ -9194,62 +10146,63 @@
     </w:pPr>
     <w:rPr>
       <w:rFonts w:asciiTheme="majorHAnsi" w:eastAsiaTheme="majorEastAsia" w:hAnsiTheme="majorHAnsi" w:cstheme="majorBidi"/>
-      <w:color w:val="0F4761" w:themeColor="accent1" w:themeShade="BF"/>
+      <w:color w:val="3A7C22" w:themeColor="accent6" w:themeShade="BF"/>
       <w:sz w:val="32"/>
       <w:szCs w:val="32"/>
+      <w:u w:val="single"/>
     </w:rPr>
   </w:style>
-  <w:style w:type="paragraph" w:styleId="Heading3">
+  <w:style w:type="paragraph" w:styleId="Titre3">
     <w:name w:val="heading 3"/>
     <w:basedOn w:val="Normal"/>
     <w:next w:val="Normal"/>
-    <w:link w:val="Heading3Char"/>
+    <w:link w:val="Titre3Car"/>
     <w:uiPriority w:val="9"/>
-    <w:semiHidden/>
     <w:unhideWhenUsed/>
     <w:qFormat/>
-    <w:rsid w:val="00E960A9"/>
+    <w:rsid w:val="00270FCB"/>
     <w:pPr>
       <w:keepNext/>
       <w:keepLines/>
       <w:spacing w:before="160" w:after="80"/>
+      <w:ind w:firstLine="708"/>
       <w:outlineLvl w:val="2"/>
     </w:pPr>
     <w:rPr>
       <w:rFonts w:eastAsiaTheme="majorEastAsia" w:cstheme="majorBidi"/>
-      <w:color w:val="0F4761" w:themeColor="accent1" w:themeShade="BF"/>
+      <w:color w:val="8DD873" w:themeColor="accent6" w:themeTint="99"/>
       <w:sz w:val="28"/>
       <w:szCs w:val="28"/>
+      <w:u w:val="single"/>
     </w:rPr>
   </w:style>
-  <w:style w:type="paragraph" w:styleId="Heading4">
+  <w:style w:type="paragraph" w:styleId="Titre4">
     <w:name w:val="heading 4"/>
     <w:basedOn w:val="Normal"/>
     <w:next w:val="Normal"/>
-    <w:link w:val="Heading4Char"/>
+    <w:link w:val="Titre4Car"/>
     <w:uiPriority w:val="9"/>
-    <w:semiHidden/>
     <w:unhideWhenUsed/>
     <w:qFormat/>
-    <w:rsid w:val="00E960A9"/>
+    <w:rsid w:val="007A4316"/>
     <w:pPr>
       <w:keepNext/>
       <w:keepLines/>
       <w:spacing w:before="80" w:after="40"/>
+      <w:ind w:left="417" w:firstLine="708"/>
       <w:outlineLvl w:val="3"/>
     </w:pPr>
     <w:rPr>
       <w:rFonts w:eastAsiaTheme="majorEastAsia" w:cstheme="majorBidi"/>
-      <w:i/>
-      <w:iCs/>
-      <w:color w:val="0F4761" w:themeColor="accent1" w:themeShade="BF"/>
+      <w:color w:val="8DD873" w:themeColor="accent6" w:themeTint="99"/>
+      <w:u w:val="single"/>
     </w:rPr>
   </w:style>
-  <w:style w:type="paragraph" w:styleId="Heading5">
+  <w:style w:type="paragraph" w:styleId="Titre5">
     <w:name w:val="heading 5"/>
     <w:basedOn w:val="Normal"/>
     <w:next w:val="Normal"/>
-    <w:link w:val="Heading5Char"/>
+    <w:link w:val="Titre5Car"/>
     <w:uiPriority w:val="9"/>
     <w:semiHidden/>
     <w:unhideWhenUsed/>
@@ -9266,11 +10219,11 @@
       <w:color w:val="0F4761" w:themeColor="accent1" w:themeShade="BF"/>
     </w:rPr>
   </w:style>
-  <w:style w:type="paragraph" w:styleId="Heading6">
+  <w:style w:type="paragraph" w:styleId="Titre6">
     <w:name w:val="heading 6"/>
     <w:basedOn w:val="Normal"/>
     <w:next w:val="Normal"/>
-    <w:link w:val="Heading6Char"/>
+    <w:link w:val="Titre6Car"/>
     <w:uiPriority w:val="9"/>
     <w:semiHidden/>
     <w:unhideWhenUsed/>
@@ -9289,11 +10242,11 @@
       <w:color w:val="595959" w:themeColor="text1" w:themeTint="A6"/>
     </w:rPr>
   </w:style>
-  <w:style w:type="paragraph" w:styleId="Heading7">
+  <w:style w:type="paragraph" w:styleId="Titre7">
     <w:name w:val="heading 7"/>
     <w:basedOn w:val="Normal"/>
     <w:next w:val="Normal"/>
-    <w:link w:val="Heading7Char"/>
+    <w:link w:val="Titre7Car"/>
     <w:uiPriority w:val="9"/>
     <w:semiHidden/>
     <w:unhideWhenUsed/>
@@ -9310,11 +10263,11 @@
       <w:color w:val="595959" w:themeColor="text1" w:themeTint="A6"/>
     </w:rPr>
   </w:style>
-  <w:style w:type="paragraph" w:styleId="Heading8">
+  <w:style w:type="paragraph" w:styleId="Titre8">
     <w:name w:val="heading 8"/>
     <w:basedOn w:val="Normal"/>
     <w:next w:val="Normal"/>
-    <w:link w:val="Heading8Char"/>
+    <w:link w:val="Titre8Car"/>
     <w:uiPriority w:val="9"/>
     <w:semiHidden/>
     <w:unhideWhenUsed/>
@@ -9333,11 +10286,11 @@
       <w:color w:val="272727" w:themeColor="text1" w:themeTint="D8"/>
     </w:rPr>
   </w:style>
-  <w:style w:type="paragraph" w:styleId="Heading9">
+  <w:style w:type="paragraph" w:styleId="Titre9">
     <w:name w:val="heading 9"/>
     <w:basedOn w:val="Normal"/>
     <w:next w:val="Normal"/>
-    <w:link w:val="Heading9Char"/>
+    <w:link w:val="Titre9Car"/>
     <w:uiPriority w:val="9"/>
     <w:semiHidden/>
     <w:unhideWhenUsed/>
@@ -9354,13 +10307,12 @@
       <w:color w:val="272727" w:themeColor="text1" w:themeTint="D8"/>
     </w:rPr>
   </w:style>
-  <w:style w:type="character" w:default="1" w:styleId="DefaultParagraphFont">
+  <w:style w:type="character" w:default="1" w:styleId="Policepardfaut">
     <w:name w:val="Default Paragraph Font"/>
     <w:uiPriority w:val="1"/>
-    <w:semiHidden/>
     <w:unhideWhenUsed/>
   </w:style>
-  <w:style w:type="table" w:default="1" w:styleId="TableNormal">
+  <w:style w:type="table" w:default="1" w:styleId="TableauNormal">
     <w:name w:val="Normal Table"/>
     <w:uiPriority w:val="99"/>
     <w:semiHidden/>
@@ -9375,71 +10327,71 @@
       </w:tblCellMar>
     </w:tblPr>
   </w:style>
-  <w:style w:type="numbering" w:default="1" w:styleId="NoList">
+  <w:style w:type="numbering" w:default="1" w:styleId="Aucuneliste">
     <w:name w:val="No List"/>
     <w:uiPriority w:val="99"/>
     <w:semiHidden/>
     <w:unhideWhenUsed/>
   </w:style>
-  <w:style w:type="character" w:customStyle="1" w:styleId="Heading1Char">
-    <w:name w:val="Heading 1 Char"/>
-    <w:basedOn w:val="DefaultParagraphFont"/>
-    <w:link w:val="Heading1"/>
+  <w:style w:type="character" w:customStyle="1" w:styleId="Titre1Car">
+    <w:name w:val="Titre 1 Car"/>
+    <w:basedOn w:val="Policepardfaut"/>
+    <w:link w:val="Titre1"/>
     <w:uiPriority w:val="9"/>
-    <w:rsid w:val="00E960A9"/>
+    <w:rsid w:val="00720538"/>
+    <w:rPr>
+      <w:rFonts w:eastAsiaTheme="majorEastAsia" w:cstheme="majorBidi"/>
+      <w:b/>
+      <w:bCs/>
+      <w:color w:val="275317" w:themeColor="accent6" w:themeShade="80"/>
+      <w:sz w:val="56"/>
+      <w:szCs w:val="56"/>
+    </w:rPr>
+  </w:style>
+  <w:style w:type="character" w:customStyle="1" w:styleId="Titre2Car">
+    <w:name w:val="Titre 2 Car"/>
+    <w:basedOn w:val="Policepardfaut"/>
+    <w:link w:val="Titre2"/>
+    <w:uiPriority w:val="9"/>
+    <w:rsid w:val="00C90859"/>
     <w:rPr>
       <w:rFonts w:asciiTheme="majorHAnsi" w:eastAsiaTheme="majorEastAsia" w:hAnsiTheme="majorHAnsi" w:cstheme="majorBidi"/>
-      <w:color w:val="0F4761" w:themeColor="accent1" w:themeShade="BF"/>
-      <w:sz w:val="40"/>
-      <w:szCs w:val="40"/>
+      <w:color w:val="3A7C22" w:themeColor="accent6" w:themeShade="BF"/>
+      <w:sz w:val="32"/>
+      <w:szCs w:val="32"/>
+      <w:u w:val="single"/>
     </w:rPr>
   </w:style>
-  <w:style w:type="character" w:customStyle="1" w:styleId="Heading2Char">
-    <w:name w:val="Heading 2 Char"/>
-    <w:basedOn w:val="DefaultParagraphFont"/>
-    <w:link w:val="Heading2"/>
+  <w:style w:type="character" w:customStyle="1" w:styleId="Titre3Car">
+    <w:name w:val="Titre 3 Car"/>
+    <w:basedOn w:val="Policepardfaut"/>
+    <w:link w:val="Titre3"/>
     <w:uiPriority w:val="9"/>
-    <w:semiHidden/>
-    <w:rsid w:val="00E960A9"/>
+    <w:rsid w:val="00270FCB"/>
     <w:rPr>
-      <w:rFonts w:asciiTheme="majorHAnsi" w:eastAsiaTheme="majorEastAsia" w:hAnsiTheme="majorHAnsi" w:cstheme="majorBidi"/>
-      <w:color w:val="0F4761" w:themeColor="accent1" w:themeShade="BF"/>
-      <w:sz w:val="32"/>
-      <w:szCs w:val="32"/>
+      <w:rFonts w:eastAsiaTheme="majorEastAsia" w:cstheme="majorBidi"/>
+      <w:color w:val="8DD873" w:themeColor="accent6" w:themeTint="99"/>
+      <w:sz w:val="28"/>
+      <w:szCs w:val="28"/>
+      <w:u w:val="single"/>
     </w:rPr>
   </w:style>
-  <w:style w:type="character" w:customStyle="1" w:styleId="Heading3Char">
-    <w:name w:val="Heading 3 Char"/>
-    <w:basedOn w:val="DefaultParagraphFont"/>
-    <w:link w:val="Heading3"/>
+  <w:style w:type="character" w:customStyle="1" w:styleId="Titre4Car">
+    <w:name w:val="Titre 4 Car"/>
+    <w:basedOn w:val="Policepardfaut"/>
+    <w:link w:val="Titre4"/>
     <w:uiPriority w:val="9"/>
-    <w:semiHidden/>
-    <w:rsid w:val="00E960A9"/>
+    <w:rsid w:val="007A4316"/>
     <w:rPr>
       <w:rFonts w:eastAsiaTheme="majorEastAsia" w:cstheme="majorBidi"/>
-      <w:color w:val="0F4761" w:themeColor="accent1" w:themeShade="BF"/>
-      <w:sz w:val="28"/>
-      <w:szCs w:val="28"/>
+      <w:color w:val="8DD873" w:themeColor="accent6" w:themeTint="99"/>
+      <w:u w:val="single"/>
     </w:rPr>
   </w:style>
-  <w:style w:type="character" w:customStyle="1" w:styleId="Heading4Char">
-    <w:name w:val="Heading 4 Char"/>
-    <w:basedOn w:val="DefaultParagraphFont"/>
-    <w:link w:val="Heading4"/>
-    <w:uiPriority w:val="9"/>
-    <w:semiHidden/>
-    <w:rsid w:val="00E960A9"/>
-    <w:rPr>
-      <w:rFonts w:eastAsiaTheme="majorEastAsia" w:cstheme="majorBidi"/>
-      <w:i/>
-      <w:iCs/>
-      <w:color w:val="0F4761" w:themeColor="accent1" w:themeShade="BF"/>
-    </w:rPr>
-  </w:style>
-  <w:style w:type="character" w:customStyle="1" w:styleId="Heading5Char">
-    <w:name w:val="Heading 5 Char"/>
-    <w:basedOn w:val="DefaultParagraphFont"/>
-    <w:link w:val="Heading5"/>
+  <w:style w:type="character" w:customStyle="1" w:styleId="Titre5Car">
+    <w:name w:val="Titre 5 Car"/>
+    <w:basedOn w:val="Policepardfaut"/>
+    <w:link w:val="Titre5"/>
     <w:uiPriority w:val="9"/>
     <w:semiHidden/>
     <w:rsid w:val="00E960A9"/>
@@ -9448,10 +10400,10 @@
       <w:color w:val="0F4761" w:themeColor="accent1" w:themeShade="BF"/>
     </w:rPr>
   </w:style>
-  <w:style w:type="character" w:customStyle="1" w:styleId="Heading6Char">
-    <w:name w:val="Heading 6 Char"/>
-    <w:basedOn w:val="DefaultParagraphFont"/>
-    <w:link w:val="Heading6"/>
+  <w:style w:type="character" w:customStyle="1" w:styleId="Titre6Car">
+    <w:name w:val="Titre 6 Car"/>
+    <w:basedOn w:val="Policepardfaut"/>
+    <w:link w:val="Titre6"/>
     <w:uiPriority w:val="9"/>
     <w:semiHidden/>
     <w:rsid w:val="00E960A9"/>
@@ -9462,10 +10414,10 @@
       <w:color w:val="595959" w:themeColor="text1" w:themeTint="A6"/>
     </w:rPr>
   </w:style>
-  <w:style w:type="character" w:customStyle="1" w:styleId="Heading7Char">
-    <w:name w:val="Heading 7 Char"/>
-    <w:basedOn w:val="DefaultParagraphFont"/>
-    <w:link w:val="Heading7"/>
+  <w:style w:type="character" w:customStyle="1" w:styleId="Titre7Car">
+    <w:name w:val="Titre 7 Car"/>
+    <w:basedOn w:val="Policepardfaut"/>
+    <w:link w:val="Titre7"/>
     <w:uiPriority w:val="9"/>
     <w:semiHidden/>
     <w:rsid w:val="00E960A9"/>
@@ -9474,10 +10426,10 @@
       <w:color w:val="595959" w:themeColor="text1" w:themeTint="A6"/>
     </w:rPr>
   </w:style>
-  <w:style w:type="character" w:customStyle="1" w:styleId="Heading8Char">
-    <w:name w:val="Heading 8 Char"/>
-    <w:basedOn w:val="DefaultParagraphFont"/>
-    <w:link w:val="Heading8"/>
+  <w:style w:type="character" w:customStyle="1" w:styleId="Titre8Car">
+    <w:name w:val="Titre 8 Car"/>
+    <w:basedOn w:val="Policepardfaut"/>
+    <w:link w:val="Titre8"/>
     <w:uiPriority w:val="9"/>
     <w:semiHidden/>
     <w:rsid w:val="00E960A9"/>
@@ -9488,10 +10440,10 @@
       <w:color w:val="272727" w:themeColor="text1" w:themeTint="D8"/>
     </w:rPr>
   </w:style>
-  <w:style w:type="character" w:customStyle="1" w:styleId="Heading9Char">
-    <w:name w:val="Heading 9 Char"/>
-    <w:basedOn w:val="DefaultParagraphFont"/>
-    <w:link w:val="Heading9"/>
+  <w:style w:type="character" w:customStyle="1" w:styleId="Titre9Car">
+    <w:name w:val="Titre 9 Car"/>
+    <w:basedOn w:val="Policepardfaut"/>
+    <w:link w:val="Titre9"/>
     <w:uiPriority w:val="9"/>
     <w:semiHidden/>
     <w:rsid w:val="00E960A9"/>
@@ -9500,11 +10452,11 @@
       <w:color w:val="272727" w:themeColor="text1" w:themeTint="D8"/>
     </w:rPr>
   </w:style>
-  <w:style w:type="paragraph" w:styleId="Title">
+  <w:style w:type="paragraph" w:styleId="Titre">
     <w:name w:val="Title"/>
     <w:basedOn w:val="Normal"/>
     <w:next w:val="Normal"/>
-    <w:link w:val="TitleChar"/>
+    <w:link w:val="TitreCar"/>
     <w:uiPriority w:val="10"/>
     <w:qFormat/>
     <w:rsid w:val="00E960A9"/>
@@ -9520,10 +10472,10 @@
       <w:szCs w:val="56"/>
     </w:rPr>
   </w:style>
-  <w:style w:type="character" w:customStyle="1" w:styleId="TitleChar">
-    <w:name w:val="Title Char"/>
-    <w:basedOn w:val="DefaultParagraphFont"/>
-    <w:link w:val="Title"/>
+  <w:style w:type="character" w:customStyle="1" w:styleId="TitreCar">
+    <w:name w:val="Titre Car"/>
+    <w:basedOn w:val="Policepardfaut"/>
+    <w:link w:val="Titre"/>
     <w:uiPriority w:val="10"/>
     <w:rsid w:val="00E960A9"/>
     <w:rPr>
@@ -9534,11 +10486,11 @@
       <w:szCs w:val="56"/>
     </w:rPr>
   </w:style>
-  <w:style w:type="paragraph" w:styleId="Subtitle">
+  <w:style w:type="paragraph" w:styleId="Sous-titre">
     <w:name w:val="Subtitle"/>
     <w:basedOn w:val="Normal"/>
     <w:next w:val="Normal"/>
-    <w:link w:val="SubtitleChar"/>
+    <w:link w:val="Sous-titreCar"/>
     <w:uiPriority w:val="11"/>
     <w:qFormat/>
     <w:rsid w:val="00E960A9"/>
@@ -9555,10 +10507,10 @@
       <w:szCs w:val="28"/>
     </w:rPr>
   </w:style>
-  <w:style w:type="character" w:customStyle="1" w:styleId="SubtitleChar">
-    <w:name w:val="Subtitle Char"/>
-    <w:basedOn w:val="DefaultParagraphFont"/>
-    <w:link w:val="Subtitle"/>
+  <w:style w:type="character" w:customStyle="1" w:styleId="Sous-titreCar">
+    <w:name w:val="Sous-titre Car"/>
+    <w:basedOn w:val="Policepardfaut"/>
+    <w:link w:val="Sous-titre"/>
     <w:uiPriority w:val="11"/>
     <w:rsid w:val="00E960A9"/>
     <w:rPr>
@@ -9569,11 +10521,11 @@
       <w:szCs w:val="28"/>
     </w:rPr>
   </w:style>
-  <w:style w:type="paragraph" w:styleId="Quote">
+  <w:style w:type="paragraph" w:styleId="Citation">
     <w:name w:val="Quote"/>
     <w:basedOn w:val="Normal"/>
     <w:next w:val="Normal"/>
-    <w:link w:val="QuoteChar"/>
+    <w:link w:val="CitationCar"/>
     <w:uiPriority w:val="29"/>
     <w:qFormat/>
     <w:rsid w:val="00E960A9"/>
@@ -9587,10 +10539,10 @@
       <w:color w:val="404040" w:themeColor="text1" w:themeTint="BF"/>
     </w:rPr>
   </w:style>
-  <w:style w:type="character" w:customStyle="1" w:styleId="QuoteChar">
-    <w:name w:val="Quote Char"/>
-    <w:basedOn w:val="DefaultParagraphFont"/>
-    <w:link w:val="Quote"/>
+  <w:style w:type="character" w:customStyle="1" w:styleId="CitationCar">
+    <w:name w:val="Citation Car"/>
+    <w:basedOn w:val="Policepardfaut"/>
+    <w:link w:val="Citation"/>
     <w:uiPriority w:val="29"/>
     <w:rsid w:val="00E960A9"/>
     <w:rPr>
@@ -9599,7 +10551,7 @@
       <w:color w:val="404040" w:themeColor="text1" w:themeTint="BF"/>
     </w:rPr>
   </w:style>
-  <w:style w:type="paragraph" w:styleId="ListParagraph">
+  <w:style w:type="paragraph" w:styleId="Paragraphedeliste">
     <w:name w:val="List Paragraph"/>
     <w:basedOn w:val="Normal"/>
     <w:uiPriority w:val="34"/>
@@ -9610,9 +10562,9 @@
       <w:contextualSpacing/>
     </w:pPr>
   </w:style>
-  <w:style w:type="character" w:styleId="IntenseEmphasis">
+  <w:style w:type="character" w:styleId="Accentuationintense">
     <w:name w:val="Intense Emphasis"/>
-    <w:basedOn w:val="DefaultParagraphFont"/>
+    <w:basedOn w:val="Policepardfaut"/>
     <w:uiPriority w:val="21"/>
     <w:qFormat/>
     <w:rsid w:val="00E960A9"/>
@@ -9622,11 +10574,11 @@
       <w:color w:val="0F4761" w:themeColor="accent1" w:themeShade="BF"/>
     </w:rPr>
   </w:style>
-  <w:style w:type="paragraph" w:styleId="IntenseQuote">
+  <w:style w:type="paragraph" w:styleId="Citationintense">
     <w:name w:val="Intense Quote"/>
     <w:basedOn w:val="Normal"/>
     <w:next w:val="Normal"/>
-    <w:link w:val="IntenseQuoteChar"/>
+    <w:link w:val="CitationintenseCar"/>
     <w:uiPriority w:val="30"/>
     <w:qFormat/>
     <w:rsid w:val="00E960A9"/>
@@ -9645,10 +10597,10 @@
       <w:color w:val="0F4761" w:themeColor="accent1" w:themeShade="BF"/>
     </w:rPr>
   </w:style>
-  <w:style w:type="character" w:customStyle="1" w:styleId="IntenseQuoteChar">
-    <w:name w:val="Intense Quote Char"/>
-    <w:basedOn w:val="DefaultParagraphFont"/>
-    <w:link w:val="IntenseQuote"/>
+  <w:style w:type="character" w:customStyle="1" w:styleId="CitationintenseCar">
+    <w:name w:val="Citation intense Car"/>
+    <w:basedOn w:val="Policepardfaut"/>
+    <w:link w:val="Citationintense"/>
     <w:uiPriority w:val="30"/>
     <w:rsid w:val="00E960A9"/>
     <w:rPr>
@@ -9657,9 +10609,9 @@
       <w:color w:val="0F4761" w:themeColor="accent1" w:themeShade="BF"/>
     </w:rPr>
   </w:style>
-  <w:style w:type="character" w:styleId="IntenseReference">
+  <w:style w:type="character" w:styleId="Rfrenceintense">
     <w:name w:val="Intense Reference"/>
-    <w:basedOn w:val="DefaultParagraphFont"/>
+    <w:basedOn w:val="Policepardfaut"/>
     <w:uiPriority w:val="32"/>
     <w:qFormat/>
     <w:rsid w:val="00E960A9"/>
@@ -9987,4 +10939,16 @@
     </a:ext>
   </a:extLst>
 </a:theme>
+</file>
+
+<file path=customXml/item1.xml><?xml version="1.0" encoding="utf-8"?>
+<b:Sources xmlns:b="http://schemas.openxmlformats.org/officeDocument/2006/bibliography" xmlns="http://schemas.openxmlformats.org/officeDocument/2006/bibliography" SelectedStyle="\APASixthEditionOfficeOnline.xsl" StyleName="APA" Version="6"/>
+</file>
+
+<file path=customXml/itemProps1.xml><?xml version="1.0" encoding="utf-8"?>
+<ds:datastoreItem xmlns:ds="http://schemas.openxmlformats.org/officeDocument/2006/customXml" ds:itemID="{7505B594-A605-46BA-A92A-115618485B61}">
+  <ds:schemaRefs>
+    <ds:schemaRef ds:uri="http://schemas.openxmlformats.org/officeDocument/2006/bibliography"/>
+  </ds:schemaRefs>
+</ds:datastoreItem>
 </file>
</xml_diff>